<commit_message>
chapter3 and 4 of the report are added
</commit_message>
<xml_diff>
--- a/CMPE314- Project Report .docx
+++ b/CMPE314- Project Report .docx
@@ -92,7 +92,13 @@
         <w:rPr>
           <w:sz w:val="32"/>
         </w:rPr>
-        <w:t>Name of Your Software System]</w:t>
+        <w:t>Online Quiz Platform</w:t>
+      </w:r>
+      <w:r>
+        <w:rPr>
+          <w:sz w:val="32"/>
+        </w:rPr>
+        <w:t>]</w:t>
       </w:r>
     </w:p>
     <w:p>
@@ -5453,37 +5459,63 @@
       </w:r>
       <w:bookmarkEnd w:id="9"/>
     </w:p>
-    <w:p>
-      <w:pPr>
-        <w:rPr>
-          <w:rFonts w:ascii="Times New Roman" w:hAnsi="Times New Roman" w:cs="Times New Roman"/>
-          <w:sz w:val="24"/>
-          <w:szCs w:val="24"/>
-        </w:rPr>
-      </w:pPr>
-      <w:r>
-        <w:rPr>
-          <w:rFonts w:ascii="Times New Roman" w:hAnsi="Times New Roman" w:cs="Times New Roman"/>
-          <w:sz w:val="24"/>
-          <w:szCs w:val="24"/>
-        </w:rPr>
-        <w:t>I</w:t>
-      </w:r>
-      <w:r>
-        <w:rPr>
-          <w:rFonts w:ascii="Times New Roman" w:hAnsi="Times New Roman" w:cs="Times New Roman"/>
-          <w:sz w:val="24"/>
-          <w:szCs w:val="24"/>
-        </w:rPr>
-        <w:t>nclude a Gantt chart showing your schedule for completing different project phases.</w:t>
-      </w:r>
-    </w:p>
+    <w:p/>
+    <w:p>
+      <w:r>
+        <w:rPr>
+          <w:noProof/>
+        </w:rPr>
+        <w:drawing>
+          <wp:inline distT="0" distB="0" distL="0" distR="0" wp14:anchorId="4D8D741E" wp14:editId="0AD9CD6B">
+            <wp:extent cx="5943600" cy="1560830"/>
+            <wp:effectExtent l="0" t="0" r="0" b="1270"/>
+            <wp:docPr id="2" name="Picture 2"/>
+            <wp:cNvGraphicFramePr>
+              <a:graphicFrameLocks xmlns:a="http://schemas.openxmlformats.org/drawingml/2006/main" noChangeAspect="1"/>
+            </wp:cNvGraphicFramePr>
+            <a:graphic xmlns:a="http://schemas.openxmlformats.org/drawingml/2006/main">
+              <a:graphicData uri="http://schemas.openxmlformats.org/drawingml/2006/picture">
+                <pic:pic xmlns:pic="http://schemas.openxmlformats.org/drawingml/2006/picture">
+                  <pic:nvPicPr>
+                    <pic:cNvPr id="2" name="Picture 2"/>
+                    <pic:cNvPicPr/>
+                  </pic:nvPicPr>
+                  <pic:blipFill>
+                    <a:blip r:embed="rId7" cstate="print">
+                      <a:extLst>
+                        <a:ext uri="{28A0092B-C50C-407E-A947-70E740481C1C}">
+                          <a14:useLocalDpi xmlns:a14="http://schemas.microsoft.com/office/drawing/2010/main" val="0"/>
+                        </a:ext>
+                      </a:extLst>
+                    </a:blip>
+                    <a:stretch>
+                      <a:fillRect/>
+                    </a:stretch>
+                  </pic:blipFill>
+                  <pic:spPr>
+                    <a:xfrm>
+                      <a:off x="0" y="0"/>
+                      <a:ext cx="5943600" cy="1560830"/>
+                    </a:xfrm>
+                    <a:prstGeom prst="rect">
+                      <a:avLst/>
+                    </a:prstGeom>
+                  </pic:spPr>
+                </pic:pic>
+              </a:graphicData>
+            </a:graphic>
+          </wp:inline>
+        </w:drawing>
+      </w:r>
+    </w:p>
+    <w:p/>
     <w:p>
       <w:pPr>
         <w:pStyle w:val="Heading1"/>
       </w:pPr>
       <w:bookmarkStart w:id="10" w:name="_Toc223948341"/>
       <w:r>
+        <w:lastRenderedPageBreak/>
         <w:t>Chapter 3: Stakeholder &amp; Requirements Elicitation</w:t>
       </w:r>
       <w:bookmarkEnd w:id="10"/>
@@ -5568,7 +5600,57 @@
           <w:sz w:val="24"/>
           <w:szCs w:val="24"/>
         </w:rPr>
-        <w:t> Those who directly interact with the system (e.g., Users, Admins).</w:t>
+        <w:t> </w:t>
+      </w:r>
+      <w:r>
+        <w:rPr>
+          <w:rFonts w:ascii="Times New Roman" w:hAnsi="Times New Roman" w:cs="Times New Roman"/>
+          <w:sz w:val="24"/>
+          <w:szCs w:val="24"/>
+        </w:rPr>
+        <w:t xml:space="preserve">Students </w:t>
+      </w:r>
+      <w:r>
+        <w:rPr>
+          <w:rFonts w:ascii="Times New Roman" w:hAnsi="Times New Roman" w:cs="Times New Roman"/>
+          <w:sz w:val="24"/>
+          <w:szCs w:val="24"/>
+        </w:rPr>
+        <w:t>(Need to have a secure exam and see their results instantly)</w:t>
+      </w:r>
+      <w:r>
+        <w:rPr>
+          <w:rFonts w:ascii="Times New Roman" w:hAnsi="Times New Roman" w:cs="Times New Roman"/>
+          <w:sz w:val="24"/>
+          <w:szCs w:val="24"/>
+        </w:rPr>
+        <w:t xml:space="preserve">, </w:t>
+      </w:r>
+    </w:p>
+    <w:p>
+      <w:pPr>
+        <w:pStyle w:val="ListParagraph"/>
+        <w:rPr>
+          <w:rFonts w:ascii="Times New Roman" w:hAnsi="Times New Roman" w:cs="Times New Roman"/>
+          <w:sz w:val="24"/>
+          <w:szCs w:val="24"/>
+        </w:rPr>
+      </w:pPr>
+      <w:r>
+        <w:rPr>
+          <w:rFonts w:ascii="Times New Roman" w:hAnsi="Times New Roman" w:cs="Times New Roman"/>
+          <w:sz w:val="24"/>
+          <w:szCs w:val="24"/>
+        </w:rPr>
+        <w:t xml:space="preserve">Teachers </w:t>
+      </w:r>
+      <w:r>
+        <w:rPr>
+          <w:rFonts w:ascii="Times New Roman" w:hAnsi="Times New Roman" w:cs="Times New Roman"/>
+          <w:sz w:val="24"/>
+          <w:szCs w:val="24"/>
+        </w:rPr>
+        <w:t>(Needs to manage exams, save time and be able to create quizzes easily).</w:t>
       </w:r>
     </w:p>
     <w:p>
@@ -5592,7 +5674,6 @@
           <w:sz w:val="24"/>
           <w:szCs w:val="24"/>
         </w:rPr>
-        <w:lastRenderedPageBreak/>
         <w:t>Secondary:</w:t>
       </w:r>
       <w:r>
@@ -5601,47 +5682,102 @@
           <w:sz w:val="24"/>
           <w:szCs w:val="24"/>
         </w:rPr>
-        <w:t> Those who are affected by the system but do not use it directly (e.g., Management, Regulatory Bodies).</w:t>
-      </w:r>
-    </w:p>
-    <w:p>
-      <w:pPr>
-        <w:rPr>
-          <w:rFonts w:ascii="Times New Roman" w:hAnsi="Times New Roman" w:cs="Times New Roman"/>
-          <w:sz w:val="24"/>
-          <w:szCs w:val="24"/>
-        </w:rPr>
-      </w:pPr>
-    </w:p>
-    <w:p>
-      <w:pPr>
-        <w:rPr>
-          <w:rFonts w:ascii="Times New Roman" w:hAnsi="Times New Roman" w:cs="Times New Roman"/>
-          <w:sz w:val="24"/>
-          <w:szCs w:val="24"/>
-        </w:rPr>
-      </w:pPr>
-    </w:p>
-    <w:p>
-      <w:pPr>
-        <w:rPr>
-          <w:rFonts w:ascii="Times New Roman" w:hAnsi="Times New Roman" w:cs="Times New Roman"/>
-          <w:sz w:val="24"/>
-          <w:szCs w:val="24"/>
-        </w:rPr>
-      </w:pPr>
-    </w:p>
-    <w:p>
-      <w:pPr>
-        <w:rPr>
-          <w:rFonts w:ascii="Times New Roman" w:hAnsi="Times New Roman" w:cs="Times New Roman"/>
-          <w:sz w:val="24"/>
-          <w:szCs w:val="24"/>
-        </w:rPr>
-      </w:pPr>
-    </w:p>
-    <w:p>
-      <w:pPr>
+        <w:t> </w:t>
+      </w:r>
+      <w:r>
+        <w:rPr>
+          <w:rFonts w:ascii="Times New Roman" w:hAnsi="Times New Roman" w:cs="Times New Roman"/>
+          <w:sz w:val="24"/>
+          <w:szCs w:val="24"/>
+        </w:rPr>
+        <w:t>System Administrator</w:t>
+      </w:r>
+      <w:r>
+        <w:rPr>
+          <w:rFonts w:ascii="Times New Roman" w:hAnsi="Times New Roman" w:cs="Times New Roman"/>
+          <w:sz w:val="24"/>
+          <w:szCs w:val="24"/>
+        </w:rPr>
+        <w:t xml:space="preserve"> (</w:t>
+      </w:r>
+      <w:r>
+        <w:rPr>
+          <w:rFonts w:ascii="Times New Roman" w:hAnsi="Times New Roman" w:cs="Times New Roman"/>
+          <w:sz w:val="24"/>
+          <w:szCs w:val="24"/>
+        </w:rPr>
+        <w:t>Manages user permissions and system backups</w:t>
+      </w:r>
+      <w:r>
+        <w:rPr>
+          <w:rFonts w:ascii="Times New Roman" w:hAnsi="Times New Roman" w:cs="Times New Roman"/>
+          <w:sz w:val="24"/>
+          <w:szCs w:val="24"/>
+        </w:rPr>
+        <w:t>),</w:t>
+      </w:r>
+    </w:p>
+    <w:p>
+      <w:pPr>
+        <w:pStyle w:val="ListParagraph"/>
+        <w:rPr>
+          <w:rFonts w:ascii="Times New Roman" w:hAnsi="Times New Roman" w:cs="Times New Roman"/>
+          <w:sz w:val="24"/>
+          <w:szCs w:val="24"/>
+        </w:rPr>
+      </w:pPr>
+      <w:r>
+        <w:rPr>
+          <w:rFonts w:ascii="Times New Roman" w:hAnsi="Times New Roman" w:cs="Times New Roman"/>
+          <w:sz w:val="24"/>
+          <w:szCs w:val="24"/>
+        </w:rPr>
+        <w:t>University Administrators</w:t>
+      </w:r>
+      <w:r>
+        <w:rPr>
+          <w:rFonts w:ascii="Times New Roman" w:hAnsi="Times New Roman" w:cs="Times New Roman"/>
+          <w:sz w:val="24"/>
+          <w:szCs w:val="24"/>
+        </w:rPr>
+        <w:t xml:space="preserve"> (</w:t>
+      </w:r>
+      <w:r>
+        <w:rPr>
+          <w:rFonts w:ascii="Times New Roman" w:hAnsi="Times New Roman" w:cs="Times New Roman"/>
+          <w:sz w:val="24"/>
+          <w:szCs w:val="24"/>
+        </w:rPr>
+        <w:t>Need to Approve and manage system usage,</w:t>
+      </w:r>
+      <w:r>
+        <w:rPr>
+          <w:rFonts w:ascii="Times New Roman" w:hAnsi="Times New Roman" w:cs="Times New Roman"/>
+          <w:sz w:val="24"/>
+          <w:szCs w:val="24"/>
+        </w:rPr>
+        <w:t xml:space="preserve"> </w:t>
+      </w:r>
+      <w:r>
+        <w:rPr>
+          <w:rFonts w:ascii="Times New Roman" w:hAnsi="Times New Roman" w:cs="Times New Roman"/>
+          <w:sz w:val="24"/>
+          <w:szCs w:val="24"/>
+        </w:rPr>
+        <w:t>monitor overall performance and reports, ensure compliance with academic policies</w:t>
+      </w:r>
+      <w:r>
+        <w:rPr>
+          <w:rFonts w:ascii="Times New Roman" w:hAnsi="Times New Roman" w:cs="Times New Roman"/>
+          <w:sz w:val="24"/>
+          <w:szCs w:val="24"/>
+        </w:rPr>
+        <w:t>)</w:t>
+      </w:r>
+    </w:p>
+    <w:p>
+      <w:pPr>
+        <w:pStyle w:val="ListParagraph"/>
         <w:rPr>
           <w:rFonts w:ascii="Times New Roman" w:hAnsi="Times New Roman" w:cs="Times New Roman"/>
           <w:sz w:val="24"/>
@@ -5678,7 +5814,94 @@
           <w:sz w:val="24"/>
           <w:szCs w:val="24"/>
         </w:rPr>
-        <w:t>For key stakeholders, describe their interest, influence, and specific requirements they might have.</w:t>
+        <w:t>There are 2 key stakeholders (students and teachers). Students want easy, and fast way to take quizzes and get the results</w:t>
+      </w:r>
+      <w:r>
+        <w:rPr>
+          <w:rFonts w:ascii="Times New Roman" w:hAnsi="Times New Roman" w:cs="Times New Roman"/>
+          <w:sz w:val="24"/>
+          <w:szCs w:val="24"/>
+        </w:rPr>
+        <w:t>, also the instructors want an easy way to create, manage, and also evaluate quizzes. The students don’t control the system, but</w:t>
+      </w:r>
+      <w:r>
+        <w:rPr>
+          <w:rFonts w:ascii="Times New Roman" w:hAnsi="Times New Roman" w:cs="Times New Roman"/>
+          <w:sz w:val="24"/>
+          <w:szCs w:val="24"/>
+        </w:rPr>
+        <w:t xml:space="preserve"> their feedback effect the usability of the system. </w:t>
+      </w:r>
+      <w:proofErr w:type="gramStart"/>
+      <w:r>
+        <w:rPr>
+          <w:rFonts w:ascii="Times New Roman" w:hAnsi="Times New Roman" w:cs="Times New Roman"/>
+          <w:sz w:val="24"/>
+          <w:szCs w:val="24"/>
+        </w:rPr>
+        <w:t>So</w:t>
+      </w:r>
+      <w:proofErr w:type="gramEnd"/>
+      <w:r>
+        <w:rPr>
+          <w:rFonts w:ascii="Times New Roman" w:hAnsi="Times New Roman" w:cs="Times New Roman"/>
+          <w:sz w:val="24"/>
+          <w:szCs w:val="24"/>
+        </w:rPr>
+        <w:t xml:space="preserve"> their influence is medium. The influence of the teachers is </w:t>
+      </w:r>
+      <w:proofErr w:type="gramStart"/>
+      <w:r>
+        <w:rPr>
+          <w:rFonts w:ascii="Times New Roman" w:hAnsi="Times New Roman" w:cs="Times New Roman"/>
+          <w:sz w:val="24"/>
+          <w:szCs w:val="24"/>
+        </w:rPr>
+        <w:t>high ,</w:t>
+      </w:r>
+      <w:proofErr w:type="gramEnd"/>
+      <w:r>
+        <w:rPr>
+          <w:rFonts w:ascii="Times New Roman" w:hAnsi="Times New Roman" w:cs="Times New Roman"/>
+          <w:sz w:val="24"/>
+          <w:szCs w:val="24"/>
+        </w:rPr>
+        <w:t xml:space="preserve"> since they define quiz content and affect system requirements.</w:t>
+      </w:r>
+    </w:p>
+    <w:p>
+      <w:pPr>
+        <w:rPr>
+          <w:rFonts w:ascii="Times New Roman" w:hAnsi="Times New Roman" w:cs="Times New Roman"/>
+          <w:sz w:val="24"/>
+          <w:szCs w:val="24"/>
+        </w:rPr>
+      </w:pPr>
+      <w:r>
+        <w:rPr>
+          <w:rFonts w:ascii="Times New Roman" w:hAnsi="Times New Roman" w:cs="Times New Roman"/>
+          <w:sz w:val="24"/>
+          <w:szCs w:val="24"/>
+        </w:rPr>
+        <w:t>Specific Requirements (students</w:t>
+      </w:r>
+      <w:proofErr w:type="gramStart"/>
+      <w:r>
+        <w:rPr>
+          <w:rFonts w:ascii="Times New Roman" w:hAnsi="Times New Roman" w:cs="Times New Roman"/>
+          <w:sz w:val="24"/>
+          <w:szCs w:val="24"/>
+        </w:rPr>
+        <w:t>) :</w:t>
+      </w:r>
+      <w:proofErr w:type="gramEnd"/>
+      <w:r>
+        <w:rPr>
+          <w:rFonts w:ascii="Times New Roman" w:hAnsi="Times New Roman" w:cs="Times New Roman"/>
+          <w:sz w:val="24"/>
+          <w:szCs w:val="24"/>
+        </w:rPr>
+        <w:t xml:space="preserve"> The system must have a simple login and user-friendly interface. It must have the ability to take quizzes easily without errors. It must give the student instant result. It must have timer and clear instructions during quizzes. </w:t>
       </w:r>
     </w:p>
     <w:p>
@@ -5691,17 +5914,30 @@
           <w:szCs w:val="24"/>
         </w:rPr>
       </w:pPr>
-    </w:p>
-    <w:p>
-      <w:pPr>
-        <w:rPr>
-          <w:rFonts w:ascii="Times New Roman" w:hAnsi="Times New Roman" w:cs="Times New Roman"/>
-          <w:b/>
-          <w:bCs/>
-          <w:sz w:val="24"/>
-          <w:szCs w:val="24"/>
-        </w:rPr>
-      </w:pPr>
+      <w:r>
+        <w:rPr>
+          <w:rFonts w:ascii="Times New Roman" w:hAnsi="Times New Roman" w:cs="Times New Roman"/>
+          <w:sz w:val="24"/>
+          <w:szCs w:val="24"/>
+        </w:rPr>
+        <w:t>Specific Re</w:t>
+      </w:r>
+      <w:r>
+        <w:rPr>
+          <w:rFonts w:ascii="Times New Roman" w:hAnsi="Times New Roman" w:cs="Times New Roman"/>
+          <w:sz w:val="24"/>
+          <w:szCs w:val="24"/>
+        </w:rPr>
+        <w:t>quirements (teachers): The system must provide creation, edition, and deletion of the quizzes for the teachers. T</w:t>
+      </w:r>
+      <w:r>
+        <w:rPr>
+          <w:rFonts w:ascii="Times New Roman" w:hAnsi="Times New Roman" w:cs="Times New Roman"/>
+          <w:sz w:val="24"/>
+          <w:szCs w:val="24"/>
+        </w:rPr>
+        <w:t>he teachers must be able to add different types of questions, and have access to student performance reports. The system must give automatic grading and result analysis.</w:t>
+      </w:r>
     </w:p>
     <w:p>
       <w:pPr>
@@ -5746,35 +5982,26 @@
           <w:sz w:val="24"/>
           <w:szCs w:val="24"/>
         </w:rPr>
-        <w:t>Detail the methods from your proposal that you actually employed (e.g., "We conducted brainstorming sessions and created user personas to derive initial requirements.").</w:t>
-      </w:r>
-    </w:p>
-    <w:p>
-      <w:pPr>
-        <w:rPr>
-          <w:rFonts w:ascii="Times New Roman" w:hAnsi="Times New Roman" w:cs="Times New Roman"/>
-          <w:sz w:val="24"/>
-          <w:szCs w:val="24"/>
-        </w:rPr>
-      </w:pPr>
-    </w:p>
-    <w:p>
-      <w:pPr>
-        <w:rPr>
-          <w:rFonts w:ascii="Times New Roman" w:hAnsi="Times New Roman" w:cs="Times New Roman"/>
-          <w:sz w:val="24"/>
-          <w:szCs w:val="24"/>
-        </w:rPr>
-      </w:pPr>
-    </w:p>
-    <w:p>
-      <w:pPr>
-        <w:rPr>
-          <w:rFonts w:ascii="Times New Roman" w:hAnsi="Times New Roman" w:cs="Times New Roman"/>
-          <w:sz w:val="24"/>
-          <w:szCs w:val="24"/>
-        </w:rPr>
-      </w:pPr>
+        <w:t xml:space="preserve">We used brainstorming sessions in the team in order to find the main features and define the system scope. We also created user personas (student and teacher) to understand each </w:t>
+      </w:r>
+      <w:proofErr w:type="gramStart"/>
+      <w:r>
+        <w:rPr>
+          <w:rFonts w:ascii="Times New Roman" w:hAnsi="Times New Roman" w:cs="Times New Roman"/>
+          <w:sz w:val="24"/>
+          <w:szCs w:val="24"/>
+        </w:rPr>
+        <w:t>role ,</w:t>
+      </w:r>
+      <w:proofErr w:type="gramEnd"/>
+      <w:r>
+        <w:rPr>
+          <w:rFonts w:ascii="Times New Roman" w:hAnsi="Times New Roman" w:cs="Times New Roman"/>
+          <w:sz w:val="24"/>
+          <w:szCs w:val="24"/>
+        </w:rPr>
+        <w:t xml:space="preserve"> what they need, and their expectations. At the end, scenario-based discussions were used to see how the users interact with the system and extract functional requirements.</w:t>
+      </w:r>
     </w:p>
     <w:p>
       <w:pPr>
@@ -5833,32 +6060,16 @@
     <w:p>
       <w:pPr>
         <w:pStyle w:val="Heading1"/>
+        <w:rPr>
+          <w:sz w:val="24"/>
+        </w:rPr>
       </w:pPr>
       <w:bookmarkStart w:id="14" w:name="_Toc223948345"/>
       <w:r>
+        <w:lastRenderedPageBreak/>
         <w:t>Chapter 4: Requirements Specification</w:t>
       </w:r>
       <w:bookmarkEnd w:id="14"/>
-    </w:p>
-    <w:p>
-      <w:pPr>
-        <w:rPr>
-          <w:rFonts w:ascii="Times New Roman" w:hAnsi="Times New Roman" w:cs="Times New Roman"/>
-          <w:b/>
-          <w:bCs/>
-          <w:sz w:val="24"/>
-          <w:szCs w:val="24"/>
-        </w:rPr>
-      </w:pPr>
-    </w:p>
-    <w:p>
-      <w:pPr>
-        <w:rPr>
-          <w:rFonts w:ascii="Times New Roman" w:hAnsi="Times New Roman" w:cs="Times New Roman"/>
-          <w:sz w:val="24"/>
-          <w:szCs w:val="24"/>
-        </w:rPr>
-      </w:pPr>
     </w:p>
     <w:p>
       <w:pPr>
@@ -5889,51 +6100,6 @@
       <w:r>
         <w:rPr>
           <w:rFonts w:ascii="Times New Roman" w:hAnsi="Times New Roman" w:cs="Times New Roman"/>
-          <w:sz w:val="24"/>
-          <w:szCs w:val="24"/>
-        </w:rPr>
-        <w:lastRenderedPageBreak/>
-        <w:t>List the system's functionalities in a structured way. Use a consistent format. You can number them (e.g., FR-001) for traceability.</w:t>
-      </w:r>
-    </w:p>
-    <w:p>
-      <w:pPr>
-        <w:numPr>
-          <w:ilvl w:val="1"/>
-          <w:numId w:val="9"/>
-        </w:numPr>
-        <w:rPr>
-          <w:rFonts w:ascii="Times New Roman" w:hAnsi="Times New Roman" w:cs="Times New Roman"/>
-          <w:sz w:val="24"/>
-          <w:szCs w:val="24"/>
-        </w:rPr>
-      </w:pPr>
-      <w:r>
-        <w:rPr>
-          <w:rFonts w:ascii="Times New Roman" w:hAnsi="Times New Roman" w:cs="Times New Roman"/>
-          <w:i/>
-          <w:iCs/>
-          <w:sz w:val="24"/>
-          <w:szCs w:val="24"/>
-        </w:rPr>
-        <w:t>Format Example:</w:t>
-      </w:r>
-    </w:p>
-    <w:p>
-      <w:pPr>
-        <w:numPr>
-          <w:ilvl w:val="2"/>
-          <w:numId w:val="9"/>
-        </w:numPr>
-        <w:rPr>
-          <w:rFonts w:ascii="Times New Roman" w:hAnsi="Times New Roman" w:cs="Times New Roman"/>
-          <w:sz w:val="24"/>
-          <w:szCs w:val="24"/>
-        </w:rPr>
-      </w:pPr>
-      <w:r>
-        <w:rPr>
-          <w:rFonts w:ascii="Times New Roman" w:hAnsi="Times New Roman" w:cs="Times New Roman"/>
           <w:b/>
           <w:bCs/>
           <w:sz w:val="24"/>
@@ -5947,21 +6113,16 @@
           <w:sz w:val="24"/>
           <w:szCs w:val="24"/>
         </w:rPr>
-        <w:t> FR-001</w:t>
-      </w:r>
-    </w:p>
-    <w:p>
-      <w:pPr>
-        <w:numPr>
-          <w:ilvl w:val="2"/>
-          <w:numId w:val="9"/>
-        </w:numPr>
-        <w:rPr>
-          <w:rFonts w:ascii="Times New Roman" w:hAnsi="Times New Roman" w:cs="Times New Roman"/>
-          <w:sz w:val="24"/>
-          <w:szCs w:val="24"/>
-        </w:rPr>
-      </w:pPr>
+        <w:t> FR-01</w:t>
+      </w:r>
+      <w:r>
+        <w:rPr>
+          <w:rFonts w:ascii="Times New Roman" w:hAnsi="Times New Roman" w:cs="Times New Roman"/>
+          <w:sz w:val="24"/>
+          <w:szCs w:val="24"/>
+        </w:rPr>
+        <w:t xml:space="preserve">   </w:t>
+      </w:r>
       <w:r>
         <w:rPr>
           <w:rFonts w:ascii="Times New Roman" w:hAnsi="Times New Roman" w:cs="Times New Roman"/>
@@ -5980,19 +6141,14 @@
         </w:rPr>
         <w:t> User Registration</w:t>
       </w:r>
-    </w:p>
-    <w:p>
-      <w:pPr>
-        <w:numPr>
-          <w:ilvl w:val="2"/>
-          <w:numId w:val="9"/>
-        </w:numPr>
-        <w:rPr>
-          <w:rFonts w:ascii="Times New Roman" w:hAnsi="Times New Roman" w:cs="Times New Roman"/>
-          <w:sz w:val="24"/>
-          <w:szCs w:val="24"/>
-        </w:rPr>
-      </w:pPr>
+      <w:r>
+        <w:rPr>
+          <w:rFonts w:ascii="Times New Roman" w:hAnsi="Times New Roman" w:cs="Times New Roman"/>
+          <w:sz w:val="24"/>
+          <w:szCs w:val="24"/>
+        </w:rPr>
+        <w:t xml:space="preserve">    </w:t>
+      </w:r>
       <w:r>
         <w:rPr>
           <w:rFonts w:ascii="Times New Roman" w:hAnsi="Times New Roman" w:cs="Times New Roman"/>
@@ -6009,35 +6165,1652 @@
           <w:sz w:val="24"/>
           <w:szCs w:val="24"/>
         </w:rPr>
-        <w:t> The system shall allow a new user to register for an account by providing a valid email address, full name, and a password.</w:t>
-      </w:r>
-    </w:p>
-    <w:p>
-      <w:pPr>
-        <w:rPr>
-          <w:rFonts w:ascii="Times New Roman" w:hAnsi="Times New Roman" w:cs="Times New Roman"/>
-          <w:sz w:val="24"/>
-          <w:szCs w:val="24"/>
-        </w:rPr>
-      </w:pPr>
-    </w:p>
-    <w:p>
-      <w:pPr>
-        <w:rPr>
-          <w:rFonts w:ascii="Times New Roman" w:hAnsi="Times New Roman" w:cs="Times New Roman"/>
-          <w:sz w:val="24"/>
-          <w:szCs w:val="24"/>
-        </w:rPr>
-      </w:pPr>
-    </w:p>
-    <w:p>
-      <w:pPr>
-        <w:rPr>
-          <w:rFonts w:ascii="Times New Roman" w:hAnsi="Times New Roman" w:cs="Times New Roman"/>
-          <w:sz w:val="24"/>
-          <w:szCs w:val="24"/>
-        </w:rPr>
-      </w:pPr>
+        <w:t xml:space="preserve"> The system shall allow </w:t>
+      </w:r>
+      <w:r>
+        <w:rPr>
+          <w:rFonts w:ascii="Times New Roman" w:hAnsi="Times New Roman" w:cs="Times New Roman"/>
+          <w:sz w:val="24"/>
+          <w:szCs w:val="24"/>
+        </w:rPr>
+        <w:t xml:space="preserve">users (students and teacher) to create an account using student number/user </w:t>
+      </w:r>
+      <w:r>
+        <w:rPr>
+          <w:rFonts w:ascii="Times New Roman" w:hAnsi="Times New Roman" w:cs="Times New Roman"/>
+          <w:sz w:val="24"/>
+          <w:szCs w:val="24"/>
+        </w:rPr>
+        <w:t>name/email address,</w:t>
+      </w:r>
+      <w:r>
+        <w:rPr>
+          <w:rFonts w:ascii="Times New Roman" w:hAnsi="Times New Roman" w:cs="Times New Roman"/>
+          <w:sz w:val="24"/>
+          <w:szCs w:val="24"/>
+        </w:rPr>
+        <w:t xml:space="preserve"> and password</w:t>
+      </w:r>
+      <w:r>
+        <w:rPr>
+          <w:rFonts w:ascii="Times New Roman" w:hAnsi="Times New Roman" w:cs="Times New Roman"/>
+          <w:sz w:val="24"/>
+          <w:szCs w:val="24"/>
+        </w:rPr>
+        <w:t>.</w:t>
+      </w:r>
+    </w:p>
+    <w:p>
+      <w:pPr>
+        <w:rPr>
+          <w:rFonts w:ascii="Times New Roman" w:hAnsi="Times New Roman" w:cs="Times New Roman"/>
+          <w:sz w:val="24"/>
+          <w:szCs w:val="24"/>
+        </w:rPr>
+      </w:pPr>
+      <w:r>
+        <w:rPr>
+          <w:rFonts w:ascii="Times New Roman" w:hAnsi="Times New Roman" w:cs="Times New Roman"/>
+          <w:b/>
+          <w:bCs/>
+          <w:sz w:val="24"/>
+          <w:szCs w:val="24"/>
+        </w:rPr>
+        <w:t>ID:</w:t>
+      </w:r>
+      <w:r>
+        <w:rPr>
+          <w:rFonts w:ascii="Times New Roman" w:hAnsi="Times New Roman" w:cs="Times New Roman"/>
+          <w:sz w:val="24"/>
+          <w:szCs w:val="24"/>
+        </w:rPr>
+        <w:t> FR-0</w:t>
+      </w:r>
+      <w:r>
+        <w:rPr>
+          <w:rFonts w:ascii="Times New Roman" w:hAnsi="Times New Roman" w:cs="Times New Roman"/>
+          <w:sz w:val="24"/>
+          <w:szCs w:val="24"/>
+        </w:rPr>
+        <w:t xml:space="preserve">2   </w:t>
+      </w:r>
+      <w:r>
+        <w:rPr>
+          <w:rFonts w:ascii="Times New Roman" w:hAnsi="Times New Roman" w:cs="Times New Roman"/>
+          <w:b/>
+          <w:bCs/>
+          <w:sz w:val="24"/>
+          <w:szCs w:val="24"/>
+        </w:rPr>
+        <w:t>Title:</w:t>
+      </w:r>
+      <w:r>
+        <w:rPr>
+          <w:rFonts w:ascii="Times New Roman" w:hAnsi="Times New Roman" w:cs="Times New Roman"/>
+          <w:sz w:val="24"/>
+          <w:szCs w:val="24"/>
+        </w:rPr>
+        <w:t xml:space="preserve"> User </w:t>
+      </w:r>
+      <w:r>
+        <w:rPr>
+          <w:rFonts w:ascii="Times New Roman" w:hAnsi="Times New Roman" w:cs="Times New Roman"/>
+          <w:sz w:val="24"/>
+          <w:szCs w:val="24"/>
+        </w:rPr>
+        <w:t xml:space="preserve">login    </w:t>
+      </w:r>
+      <w:r>
+        <w:rPr>
+          <w:rFonts w:ascii="Times New Roman" w:hAnsi="Times New Roman" w:cs="Times New Roman"/>
+          <w:b/>
+          <w:bCs/>
+          <w:sz w:val="24"/>
+          <w:szCs w:val="24"/>
+        </w:rPr>
+        <w:t>Description:</w:t>
+      </w:r>
+      <w:r>
+        <w:rPr>
+          <w:rFonts w:ascii="Times New Roman" w:hAnsi="Times New Roman" w:cs="Times New Roman"/>
+          <w:sz w:val="24"/>
+          <w:szCs w:val="24"/>
+        </w:rPr>
+        <w:t xml:space="preserve"> The system shall allow </w:t>
+      </w:r>
+      <w:r>
+        <w:rPr>
+          <w:rFonts w:ascii="Times New Roman" w:hAnsi="Times New Roman" w:cs="Times New Roman"/>
+          <w:sz w:val="24"/>
+          <w:szCs w:val="24"/>
+        </w:rPr>
+        <w:t xml:space="preserve">users (students and teacher) to </w:t>
+      </w:r>
+      <w:r>
+        <w:rPr>
+          <w:rFonts w:ascii="Times New Roman" w:hAnsi="Times New Roman" w:cs="Times New Roman"/>
+          <w:sz w:val="24"/>
+          <w:szCs w:val="24"/>
+        </w:rPr>
+        <w:t>enter to the system securely</w:t>
+      </w:r>
+      <w:r>
+        <w:rPr>
+          <w:rFonts w:ascii="Times New Roman" w:hAnsi="Times New Roman" w:cs="Times New Roman"/>
+          <w:sz w:val="24"/>
+          <w:szCs w:val="24"/>
+        </w:rPr>
+        <w:t>.</w:t>
+      </w:r>
+    </w:p>
+    <w:p>
+      <w:pPr>
+        <w:rPr>
+          <w:rFonts w:ascii="Times New Roman" w:hAnsi="Times New Roman" w:cs="Times New Roman"/>
+          <w:sz w:val="24"/>
+          <w:szCs w:val="24"/>
+        </w:rPr>
+      </w:pPr>
+      <w:r>
+        <w:rPr>
+          <w:rFonts w:ascii="Times New Roman" w:hAnsi="Times New Roman" w:cs="Times New Roman"/>
+          <w:b/>
+          <w:bCs/>
+          <w:sz w:val="24"/>
+          <w:szCs w:val="24"/>
+        </w:rPr>
+        <w:t>ID:</w:t>
+      </w:r>
+      <w:r>
+        <w:rPr>
+          <w:rFonts w:ascii="Times New Roman" w:hAnsi="Times New Roman" w:cs="Times New Roman"/>
+          <w:sz w:val="24"/>
+          <w:szCs w:val="24"/>
+        </w:rPr>
+        <w:t> FR-0</w:t>
+      </w:r>
+      <w:r>
+        <w:rPr>
+          <w:rFonts w:ascii="Times New Roman" w:hAnsi="Times New Roman" w:cs="Times New Roman"/>
+          <w:sz w:val="24"/>
+          <w:szCs w:val="24"/>
+        </w:rPr>
+        <w:t>3</w:t>
+      </w:r>
+      <w:r>
+        <w:rPr>
+          <w:rFonts w:ascii="Times New Roman" w:hAnsi="Times New Roman" w:cs="Times New Roman"/>
+          <w:sz w:val="24"/>
+          <w:szCs w:val="24"/>
+        </w:rPr>
+        <w:t xml:space="preserve">   </w:t>
+      </w:r>
+      <w:r>
+        <w:rPr>
+          <w:rFonts w:ascii="Times New Roman" w:hAnsi="Times New Roman" w:cs="Times New Roman"/>
+          <w:b/>
+          <w:bCs/>
+          <w:sz w:val="24"/>
+          <w:szCs w:val="24"/>
+        </w:rPr>
+        <w:t>Title:</w:t>
+      </w:r>
+      <w:r>
+        <w:rPr>
+          <w:rFonts w:ascii="Times New Roman" w:hAnsi="Times New Roman" w:cs="Times New Roman"/>
+          <w:sz w:val="24"/>
+          <w:szCs w:val="24"/>
+        </w:rPr>
+        <w:t> </w:t>
+      </w:r>
+      <w:r>
+        <w:rPr>
+          <w:rFonts w:ascii="Times New Roman" w:hAnsi="Times New Roman" w:cs="Times New Roman"/>
+          <w:sz w:val="24"/>
+          <w:szCs w:val="24"/>
+        </w:rPr>
+        <w:t xml:space="preserve">Profile management  </w:t>
+      </w:r>
+      <w:r>
+        <w:rPr>
+          <w:rFonts w:ascii="Times New Roman" w:hAnsi="Times New Roman" w:cs="Times New Roman"/>
+          <w:sz w:val="24"/>
+          <w:szCs w:val="24"/>
+        </w:rPr>
+        <w:t xml:space="preserve"> </w:t>
+      </w:r>
+      <w:r>
+        <w:rPr>
+          <w:rFonts w:ascii="Times New Roman" w:hAnsi="Times New Roman" w:cs="Times New Roman"/>
+          <w:b/>
+          <w:bCs/>
+          <w:sz w:val="24"/>
+          <w:szCs w:val="24"/>
+        </w:rPr>
+        <w:t>Description:</w:t>
+      </w:r>
+      <w:r>
+        <w:rPr>
+          <w:rFonts w:ascii="Times New Roman" w:hAnsi="Times New Roman" w:cs="Times New Roman"/>
+          <w:sz w:val="24"/>
+          <w:szCs w:val="24"/>
+        </w:rPr>
+        <w:t> T</w:t>
+      </w:r>
+      <w:r>
+        <w:rPr>
+          <w:rFonts w:ascii="Times New Roman" w:hAnsi="Times New Roman" w:cs="Times New Roman"/>
+          <w:sz w:val="24"/>
+          <w:szCs w:val="24"/>
+        </w:rPr>
+        <w:t>he system shall allow the authenticated user to view and edit their personal data, including name and password.</w:t>
+      </w:r>
+    </w:p>
+    <w:p>
+      <w:pPr>
+        <w:rPr>
+          <w:rFonts w:ascii="Times New Roman" w:hAnsi="Times New Roman" w:cs="Times New Roman"/>
+          <w:sz w:val="24"/>
+          <w:szCs w:val="24"/>
+        </w:rPr>
+      </w:pPr>
+      <w:r>
+        <w:rPr>
+          <w:rFonts w:ascii="Times New Roman" w:hAnsi="Times New Roman" w:cs="Times New Roman"/>
+          <w:b/>
+          <w:bCs/>
+          <w:sz w:val="24"/>
+          <w:szCs w:val="24"/>
+        </w:rPr>
+        <w:t>ID:</w:t>
+      </w:r>
+      <w:r>
+        <w:rPr>
+          <w:rFonts w:ascii="Times New Roman" w:hAnsi="Times New Roman" w:cs="Times New Roman"/>
+          <w:sz w:val="24"/>
+          <w:szCs w:val="24"/>
+        </w:rPr>
+        <w:t> FR-0</w:t>
+      </w:r>
+      <w:r>
+        <w:rPr>
+          <w:rFonts w:ascii="Times New Roman" w:hAnsi="Times New Roman" w:cs="Times New Roman"/>
+          <w:sz w:val="24"/>
+          <w:szCs w:val="24"/>
+        </w:rPr>
+        <w:t>4</w:t>
+      </w:r>
+      <w:r>
+        <w:rPr>
+          <w:rFonts w:ascii="Times New Roman" w:hAnsi="Times New Roman" w:cs="Times New Roman"/>
+          <w:sz w:val="24"/>
+          <w:szCs w:val="24"/>
+        </w:rPr>
+        <w:t xml:space="preserve">   </w:t>
+      </w:r>
+      <w:r>
+        <w:rPr>
+          <w:rFonts w:ascii="Times New Roman" w:hAnsi="Times New Roman" w:cs="Times New Roman"/>
+          <w:b/>
+          <w:bCs/>
+          <w:sz w:val="24"/>
+          <w:szCs w:val="24"/>
+        </w:rPr>
+        <w:t>Title:</w:t>
+      </w:r>
+      <w:r>
+        <w:rPr>
+          <w:rFonts w:ascii="Times New Roman" w:hAnsi="Times New Roman" w:cs="Times New Roman"/>
+          <w:sz w:val="24"/>
+          <w:szCs w:val="24"/>
+        </w:rPr>
+        <w:t> </w:t>
+      </w:r>
+      <w:r>
+        <w:rPr>
+          <w:rFonts w:ascii="Times New Roman" w:hAnsi="Times New Roman" w:cs="Times New Roman"/>
+          <w:sz w:val="24"/>
+          <w:szCs w:val="24"/>
+        </w:rPr>
+        <w:t>Instructor admin login</w:t>
+      </w:r>
+      <w:r>
+        <w:rPr>
+          <w:rFonts w:ascii="Times New Roman" w:hAnsi="Times New Roman" w:cs="Times New Roman"/>
+          <w:sz w:val="24"/>
+          <w:szCs w:val="24"/>
+        </w:rPr>
+        <w:t xml:space="preserve">   </w:t>
+      </w:r>
+      <w:r>
+        <w:rPr>
+          <w:rFonts w:ascii="Times New Roman" w:hAnsi="Times New Roman" w:cs="Times New Roman"/>
+          <w:b/>
+          <w:bCs/>
+          <w:sz w:val="24"/>
+          <w:szCs w:val="24"/>
+        </w:rPr>
+        <w:t>Description:</w:t>
+      </w:r>
+      <w:r>
+        <w:rPr>
+          <w:rFonts w:ascii="Times New Roman" w:hAnsi="Times New Roman" w:cs="Times New Roman"/>
+          <w:sz w:val="24"/>
+          <w:szCs w:val="24"/>
+        </w:rPr>
+        <w:t> </w:t>
+      </w:r>
+      <w:r>
+        <w:rPr>
+          <w:rFonts w:ascii="Times New Roman" w:hAnsi="Times New Roman" w:cs="Times New Roman"/>
+          <w:sz w:val="24"/>
+          <w:szCs w:val="24"/>
+        </w:rPr>
+        <w:t xml:space="preserve">The system must allow the </w:t>
+      </w:r>
+      <w:proofErr w:type="gramStart"/>
+      <w:r>
+        <w:rPr>
+          <w:rFonts w:ascii="Times New Roman" w:hAnsi="Times New Roman" w:cs="Times New Roman"/>
+          <w:sz w:val="24"/>
+          <w:szCs w:val="24"/>
+        </w:rPr>
+        <w:t>Instructor</w:t>
+      </w:r>
+      <w:proofErr w:type="gramEnd"/>
+      <w:r>
+        <w:rPr>
+          <w:rFonts w:ascii="Times New Roman" w:hAnsi="Times New Roman" w:cs="Times New Roman"/>
+          <w:sz w:val="24"/>
+          <w:szCs w:val="24"/>
+        </w:rPr>
+        <w:t xml:space="preserve"> to log in with administrative credentials, ensuring exclusive access to the management panel</w:t>
+      </w:r>
+    </w:p>
+    <w:p>
+      <w:pPr>
+        <w:rPr>
+          <w:rFonts w:ascii="Times New Roman" w:hAnsi="Times New Roman" w:cs="Times New Roman"/>
+          <w:sz w:val="24"/>
+          <w:szCs w:val="24"/>
+        </w:rPr>
+      </w:pPr>
+      <w:r>
+        <w:rPr>
+          <w:rFonts w:ascii="Times New Roman" w:hAnsi="Times New Roman" w:cs="Times New Roman"/>
+          <w:b/>
+          <w:bCs/>
+          <w:sz w:val="24"/>
+          <w:szCs w:val="24"/>
+        </w:rPr>
+        <w:t>ID:</w:t>
+      </w:r>
+      <w:r>
+        <w:rPr>
+          <w:rFonts w:ascii="Times New Roman" w:hAnsi="Times New Roman" w:cs="Times New Roman"/>
+          <w:sz w:val="24"/>
+          <w:szCs w:val="24"/>
+        </w:rPr>
+        <w:t> FR-0</w:t>
+      </w:r>
+      <w:r>
+        <w:rPr>
+          <w:rFonts w:ascii="Times New Roman" w:hAnsi="Times New Roman" w:cs="Times New Roman"/>
+          <w:sz w:val="24"/>
+          <w:szCs w:val="24"/>
+        </w:rPr>
+        <w:t>5</w:t>
+      </w:r>
+      <w:r>
+        <w:rPr>
+          <w:rFonts w:ascii="Times New Roman" w:hAnsi="Times New Roman" w:cs="Times New Roman"/>
+          <w:sz w:val="24"/>
+          <w:szCs w:val="24"/>
+        </w:rPr>
+        <w:t xml:space="preserve">   </w:t>
+      </w:r>
+      <w:r>
+        <w:rPr>
+          <w:rFonts w:ascii="Times New Roman" w:hAnsi="Times New Roman" w:cs="Times New Roman"/>
+          <w:b/>
+          <w:bCs/>
+          <w:sz w:val="24"/>
+          <w:szCs w:val="24"/>
+        </w:rPr>
+        <w:t>Title:</w:t>
+      </w:r>
+      <w:r>
+        <w:rPr>
+          <w:rFonts w:ascii="Times New Roman" w:hAnsi="Times New Roman" w:cs="Times New Roman"/>
+          <w:sz w:val="24"/>
+          <w:szCs w:val="24"/>
+        </w:rPr>
+        <w:t> </w:t>
+      </w:r>
+      <w:r>
+        <w:rPr>
+          <w:rFonts w:ascii="Times New Roman" w:hAnsi="Times New Roman" w:cs="Times New Roman"/>
+          <w:sz w:val="24"/>
+          <w:szCs w:val="24"/>
+        </w:rPr>
+        <w:t>View Available Quizzes</w:t>
+      </w:r>
+      <w:r>
+        <w:rPr>
+          <w:rFonts w:ascii="Times New Roman" w:hAnsi="Times New Roman" w:cs="Times New Roman"/>
+          <w:sz w:val="24"/>
+          <w:szCs w:val="24"/>
+        </w:rPr>
+        <w:t xml:space="preserve"> </w:t>
+      </w:r>
+      <w:r>
+        <w:rPr>
+          <w:rFonts w:ascii="Times New Roman" w:hAnsi="Times New Roman" w:cs="Times New Roman"/>
+          <w:b/>
+          <w:bCs/>
+          <w:sz w:val="24"/>
+          <w:szCs w:val="24"/>
+        </w:rPr>
+        <w:t>Description:</w:t>
+      </w:r>
+      <w:r>
+        <w:rPr>
+          <w:rFonts w:ascii="Times New Roman" w:hAnsi="Times New Roman" w:cs="Times New Roman"/>
+          <w:sz w:val="24"/>
+          <w:szCs w:val="24"/>
+        </w:rPr>
+        <w:t> </w:t>
+      </w:r>
+      <w:r>
+        <w:rPr>
+          <w:rFonts w:ascii="Times New Roman" w:hAnsi="Times New Roman" w:cs="Times New Roman"/>
+          <w:sz w:val="24"/>
+          <w:szCs w:val="24"/>
+        </w:rPr>
+        <w:t>The system shall display to the authenticated user a list of available quizzes.</w:t>
+      </w:r>
+    </w:p>
+    <w:p>
+      <w:pPr>
+        <w:rPr>
+          <w:rFonts w:ascii="Times New Roman" w:hAnsi="Times New Roman" w:cs="Times New Roman"/>
+          <w:sz w:val="24"/>
+          <w:szCs w:val="24"/>
+        </w:rPr>
+      </w:pPr>
+      <w:r>
+        <w:rPr>
+          <w:rFonts w:ascii="Times New Roman" w:hAnsi="Times New Roman" w:cs="Times New Roman"/>
+          <w:b/>
+          <w:bCs/>
+          <w:sz w:val="24"/>
+          <w:szCs w:val="24"/>
+        </w:rPr>
+        <w:t>ID:</w:t>
+      </w:r>
+      <w:r>
+        <w:rPr>
+          <w:rFonts w:ascii="Times New Roman" w:hAnsi="Times New Roman" w:cs="Times New Roman"/>
+          <w:sz w:val="24"/>
+          <w:szCs w:val="24"/>
+        </w:rPr>
+        <w:t> FR-0</w:t>
+      </w:r>
+      <w:r>
+        <w:rPr>
+          <w:rFonts w:ascii="Times New Roman" w:hAnsi="Times New Roman" w:cs="Times New Roman"/>
+          <w:sz w:val="24"/>
+          <w:szCs w:val="24"/>
+        </w:rPr>
+        <w:t>6</w:t>
+      </w:r>
+      <w:r>
+        <w:rPr>
+          <w:rFonts w:ascii="Times New Roman" w:hAnsi="Times New Roman" w:cs="Times New Roman"/>
+          <w:sz w:val="24"/>
+          <w:szCs w:val="24"/>
+        </w:rPr>
+        <w:t xml:space="preserve">   </w:t>
+      </w:r>
+      <w:r>
+        <w:rPr>
+          <w:rFonts w:ascii="Times New Roman" w:hAnsi="Times New Roman" w:cs="Times New Roman"/>
+          <w:b/>
+          <w:bCs/>
+          <w:sz w:val="24"/>
+          <w:szCs w:val="24"/>
+        </w:rPr>
+        <w:t>Title:</w:t>
+      </w:r>
+      <w:r>
+        <w:rPr>
+          <w:rFonts w:ascii="Times New Roman" w:hAnsi="Times New Roman" w:cs="Times New Roman"/>
+          <w:sz w:val="24"/>
+          <w:szCs w:val="24"/>
+        </w:rPr>
+        <w:t> </w:t>
+      </w:r>
+      <w:r>
+        <w:rPr>
+          <w:rFonts w:ascii="Times New Roman" w:hAnsi="Times New Roman" w:cs="Times New Roman"/>
+          <w:sz w:val="24"/>
+          <w:szCs w:val="24"/>
+        </w:rPr>
+        <w:t>Take Quiz</w:t>
+      </w:r>
+      <w:r>
+        <w:rPr>
+          <w:rFonts w:ascii="Times New Roman" w:hAnsi="Times New Roman" w:cs="Times New Roman"/>
+          <w:sz w:val="24"/>
+          <w:szCs w:val="24"/>
+        </w:rPr>
+        <w:t xml:space="preserve">   </w:t>
+      </w:r>
+      <w:r>
+        <w:rPr>
+          <w:rFonts w:ascii="Times New Roman" w:hAnsi="Times New Roman" w:cs="Times New Roman"/>
+          <w:b/>
+          <w:bCs/>
+          <w:sz w:val="24"/>
+          <w:szCs w:val="24"/>
+        </w:rPr>
+        <w:t>Description:</w:t>
+      </w:r>
+      <w:r>
+        <w:rPr>
+          <w:rFonts w:ascii="Times New Roman" w:hAnsi="Times New Roman" w:cs="Times New Roman"/>
+          <w:sz w:val="24"/>
+          <w:szCs w:val="24"/>
+        </w:rPr>
+        <w:t> </w:t>
+      </w:r>
+      <w:r>
+        <w:rPr>
+          <w:rFonts w:ascii="Times New Roman" w:hAnsi="Times New Roman" w:cs="Times New Roman"/>
+          <w:sz w:val="24"/>
+          <w:szCs w:val="24"/>
+        </w:rPr>
+        <w:t>The system shall allow the user to select a quiz and answer the questions one at a time.</w:t>
+      </w:r>
+    </w:p>
+    <w:p>
+      <w:pPr>
+        <w:rPr>
+          <w:rFonts w:ascii="Times New Roman" w:hAnsi="Times New Roman" w:cs="Times New Roman"/>
+          <w:sz w:val="24"/>
+          <w:szCs w:val="24"/>
+        </w:rPr>
+      </w:pPr>
+      <w:r>
+        <w:rPr>
+          <w:rFonts w:ascii="Times New Roman" w:hAnsi="Times New Roman" w:cs="Times New Roman"/>
+          <w:b/>
+          <w:bCs/>
+          <w:sz w:val="24"/>
+          <w:szCs w:val="24"/>
+        </w:rPr>
+        <w:t>ID:</w:t>
+      </w:r>
+      <w:r>
+        <w:rPr>
+          <w:rFonts w:ascii="Times New Roman" w:hAnsi="Times New Roman" w:cs="Times New Roman"/>
+          <w:sz w:val="24"/>
+          <w:szCs w:val="24"/>
+        </w:rPr>
+        <w:t> FR-0</w:t>
+      </w:r>
+      <w:r>
+        <w:rPr>
+          <w:rFonts w:ascii="Times New Roman" w:hAnsi="Times New Roman" w:cs="Times New Roman"/>
+          <w:sz w:val="24"/>
+          <w:szCs w:val="24"/>
+        </w:rPr>
+        <w:t>7</w:t>
+      </w:r>
+      <w:r>
+        <w:rPr>
+          <w:rFonts w:ascii="Times New Roman" w:hAnsi="Times New Roman" w:cs="Times New Roman"/>
+          <w:sz w:val="24"/>
+          <w:szCs w:val="24"/>
+        </w:rPr>
+        <w:t xml:space="preserve">   </w:t>
+      </w:r>
+      <w:r>
+        <w:rPr>
+          <w:rFonts w:ascii="Times New Roman" w:hAnsi="Times New Roman" w:cs="Times New Roman"/>
+          <w:b/>
+          <w:bCs/>
+          <w:sz w:val="24"/>
+          <w:szCs w:val="24"/>
+        </w:rPr>
+        <w:t>Title:</w:t>
+      </w:r>
+      <w:r>
+        <w:rPr>
+          <w:rFonts w:ascii="Times New Roman" w:hAnsi="Times New Roman" w:cs="Times New Roman"/>
+          <w:sz w:val="24"/>
+          <w:szCs w:val="24"/>
+        </w:rPr>
+        <w:t> </w:t>
+      </w:r>
+      <w:r>
+        <w:t xml:space="preserve"> </w:t>
+      </w:r>
+      <w:r>
+        <w:rPr>
+          <w:rFonts w:ascii="Times New Roman" w:hAnsi="Times New Roman" w:cs="Times New Roman"/>
+          <w:sz w:val="24"/>
+          <w:szCs w:val="24"/>
+        </w:rPr>
+        <w:t>Automatic Scoring</w:t>
+      </w:r>
+      <w:r>
+        <w:rPr>
+          <w:rFonts w:ascii="Times New Roman" w:hAnsi="Times New Roman" w:cs="Times New Roman"/>
+          <w:sz w:val="24"/>
+          <w:szCs w:val="24"/>
+        </w:rPr>
+        <w:t xml:space="preserve">   </w:t>
+      </w:r>
+      <w:r>
+        <w:rPr>
+          <w:rFonts w:ascii="Times New Roman" w:hAnsi="Times New Roman" w:cs="Times New Roman"/>
+          <w:b/>
+          <w:bCs/>
+          <w:sz w:val="24"/>
+          <w:szCs w:val="24"/>
+        </w:rPr>
+        <w:t>Description:</w:t>
+      </w:r>
+      <w:r>
+        <w:rPr>
+          <w:rFonts w:ascii="Times New Roman" w:hAnsi="Times New Roman" w:cs="Times New Roman"/>
+          <w:sz w:val="24"/>
+          <w:szCs w:val="24"/>
+        </w:rPr>
+        <w:t> </w:t>
+      </w:r>
+      <w:r>
+        <w:rPr>
+          <w:rFonts w:ascii="Times New Roman" w:hAnsi="Times New Roman" w:cs="Times New Roman"/>
+          <w:sz w:val="24"/>
+          <w:szCs w:val="24"/>
+        </w:rPr>
+        <w:t>At the end of the quiz, the system should automatically calculate the total score based on the number of correct answers and present the result to the user.</w:t>
+      </w:r>
+    </w:p>
+    <w:p>
+      <w:pPr>
+        <w:rPr>
+          <w:rFonts w:ascii="Times New Roman" w:hAnsi="Times New Roman" w:cs="Times New Roman"/>
+          <w:sz w:val="24"/>
+          <w:szCs w:val="24"/>
+        </w:rPr>
+      </w:pPr>
+      <w:r>
+        <w:rPr>
+          <w:rFonts w:ascii="Times New Roman" w:hAnsi="Times New Roman" w:cs="Times New Roman"/>
+          <w:b/>
+          <w:bCs/>
+          <w:sz w:val="24"/>
+          <w:szCs w:val="24"/>
+        </w:rPr>
+        <w:t>ID:</w:t>
+      </w:r>
+      <w:r>
+        <w:rPr>
+          <w:rFonts w:ascii="Times New Roman" w:hAnsi="Times New Roman" w:cs="Times New Roman"/>
+          <w:sz w:val="24"/>
+          <w:szCs w:val="24"/>
+        </w:rPr>
+        <w:t> FR-0</w:t>
+      </w:r>
+      <w:r>
+        <w:rPr>
+          <w:rFonts w:ascii="Times New Roman" w:hAnsi="Times New Roman" w:cs="Times New Roman"/>
+          <w:sz w:val="24"/>
+          <w:szCs w:val="24"/>
+        </w:rPr>
+        <w:t>8</w:t>
+      </w:r>
+      <w:r>
+        <w:rPr>
+          <w:rFonts w:ascii="Times New Roman" w:hAnsi="Times New Roman" w:cs="Times New Roman"/>
+          <w:sz w:val="24"/>
+          <w:szCs w:val="24"/>
+        </w:rPr>
+        <w:t xml:space="preserve">   </w:t>
+      </w:r>
+      <w:r>
+        <w:rPr>
+          <w:rFonts w:ascii="Times New Roman" w:hAnsi="Times New Roman" w:cs="Times New Roman"/>
+          <w:b/>
+          <w:bCs/>
+          <w:sz w:val="24"/>
+          <w:szCs w:val="24"/>
+        </w:rPr>
+        <w:t>Title:</w:t>
+      </w:r>
+      <w:r>
+        <w:rPr>
+          <w:rFonts w:ascii="Times New Roman" w:hAnsi="Times New Roman" w:cs="Times New Roman"/>
+          <w:sz w:val="24"/>
+          <w:szCs w:val="24"/>
+        </w:rPr>
+        <w:t> </w:t>
+      </w:r>
+      <w:r>
+        <w:rPr>
+          <w:rFonts w:ascii="Times New Roman" w:hAnsi="Times New Roman" w:cs="Times New Roman"/>
+          <w:sz w:val="24"/>
+          <w:szCs w:val="24"/>
+        </w:rPr>
+        <w:t>Quiz Result Summary</w:t>
+      </w:r>
+      <w:r>
+        <w:rPr>
+          <w:rFonts w:ascii="Times New Roman" w:hAnsi="Times New Roman" w:cs="Times New Roman"/>
+          <w:sz w:val="24"/>
+          <w:szCs w:val="24"/>
+        </w:rPr>
+        <w:t xml:space="preserve">  </w:t>
+      </w:r>
+      <w:r>
+        <w:rPr>
+          <w:rFonts w:ascii="Times New Roman" w:hAnsi="Times New Roman" w:cs="Times New Roman"/>
+          <w:sz w:val="24"/>
+          <w:szCs w:val="24"/>
+        </w:rPr>
+        <w:t xml:space="preserve"> </w:t>
+      </w:r>
+      <w:r>
+        <w:rPr>
+          <w:rFonts w:ascii="Times New Roman" w:hAnsi="Times New Roman" w:cs="Times New Roman"/>
+          <w:b/>
+          <w:bCs/>
+          <w:sz w:val="24"/>
+          <w:szCs w:val="24"/>
+        </w:rPr>
+        <w:t>Description:</w:t>
+      </w:r>
+      <w:r>
+        <w:rPr>
+          <w:rFonts w:ascii="Times New Roman" w:hAnsi="Times New Roman" w:cs="Times New Roman"/>
+          <w:sz w:val="24"/>
+          <w:szCs w:val="24"/>
+        </w:rPr>
+        <w:t> </w:t>
+      </w:r>
+      <w:r>
+        <w:rPr>
+          <w:rFonts w:ascii="Times New Roman" w:hAnsi="Times New Roman" w:cs="Times New Roman"/>
+          <w:sz w:val="24"/>
+          <w:szCs w:val="24"/>
+        </w:rPr>
+        <w:t>The system should display a summary at the end of the quiz indicating which answers the user got right and which ones got wrong, showing the correct answers for each question.</w:t>
+      </w:r>
+    </w:p>
+    <w:p>
+      <w:pPr>
+        <w:rPr>
+          <w:rFonts w:ascii="Times New Roman" w:hAnsi="Times New Roman" w:cs="Times New Roman"/>
+          <w:sz w:val="24"/>
+          <w:szCs w:val="24"/>
+        </w:rPr>
+      </w:pPr>
+      <w:r>
+        <w:rPr>
+          <w:rFonts w:ascii="Times New Roman" w:hAnsi="Times New Roman" w:cs="Times New Roman"/>
+          <w:b/>
+          <w:bCs/>
+          <w:sz w:val="24"/>
+          <w:szCs w:val="24"/>
+        </w:rPr>
+        <w:t>ID:</w:t>
+      </w:r>
+      <w:r>
+        <w:rPr>
+          <w:rFonts w:ascii="Times New Roman" w:hAnsi="Times New Roman" w:cs="Times New Roman"/>
+          <w:sz w:val="24"/>
+          <w:szCs w:val="24"/>
+        </w:rPr>
+        <w:t> FR-0</w:t>
+      </w:r>
+      <w:r>
+        <w:rPr>
+          <w:rFonts w:ascii="Times New Roman" w:hAnsi="Times New Roman" w:cs="Times New Roman"/>
+          <w:sz w:val="24"/>
+          <w:szCs w:val="24"/>
+        </w:rPr>
+        <w:t>9</w:t>
+      </w:r>
+      <w:r>
+        <w:rPr>
+          <w:rFonts w:ascii="Times New Roman" w:hAnsi="Times New Roman" w:cs="Times New Roman"/>
+          <w:sz w:val="24"/>
+          <w:szCs w:val="24"/>
+        </w:rPr>
+        <w:t xml:space="preserve">   </w:t>
+      </w:r>
+      <w:r>
+        <w:rPr>
+          <w:rFonts w:ascii="Times New Roman" w:hAnsi="Times New Roman" w:cs="Times New Roman"/>
+          <w:b/>
+          <w:bCs/>
+          <w:sz w:val="24"/>
+          <w:szCs w:val="24"/>
+        </w:rPr>
+        <w:t>Title:</w:t>
+      </w:r>
+      <w:r>
+        <w:rPr>
+          <w:rFonts w:ascii="Times New Roman" w:hAnsi="Times New Roman" w:cs="Times New Roman"/>
+          <w:sz w:val="24"/>
+          <w:szCs w:val="24"/>
+        </w:rPr>
+        <w:t> </w:t>
+      </w:r>
+      <w:r>
+        <w:rPr>
+          <w:rFonts w:ascii="Times New Roman" w:hAnsi="Times New Roman" w:cs="Times New Roman"/>
+          <w:sz w:val="24"/>
+          <w:szCs w:val="24"/>
+        </w:rPr>
+        <w:t>View Quiz History</w:t>
+      </w:r>
+      <w:r>
+        <w:rPr>
+          <w:rFonts w:ascii="Times New Roman" w:hAnsi="Times New Roman" w:cs="Times New Roman"/>
+          <w:sz w:val="24"/>
+          <w:szCs w:val="24"/>
+        </w:rPr>
+        <w:t xml:space="preserve">    </w:t>
+      </w:r>
+      <w:r>
+        <w:rPr>
+          <w:rFonts w:ascii="Times New Roman" w:hAnsi="Times New Roman" w:cs="Times New Roman"/>
+          <w:b/>
+          <w:bCs/>
+          <w:sz w:val="24"/>
+          <w:szCs w:val="24"/>
+        </w:rPr>
+        <w:t>Description:</w:t>
+      </w:r>
+      <w:r>
+        <w:rPr>
+          <w:rFonts w:ascii="Times New Roman" w:hAnsi="Times New Roman" w:cs="Times New Roman"/>
+          <w:sz w:val="24"/>
+          <w:szCs w:val="24"/>
+        </w:rPr>
+        <w:t> </w:t>
+      </w:r>
+      <w:r>
+        <w:rPr>
+          <w:rFonts w:ascii="Times New Roman" w:hAnsi="Times New Roman" w:cs="Times New Roman"/>
+          <w:sz w:val="24"/>
+          <w:szCs w:val="24"/>
+        </w:rPr>
+        <w:t>The system shall allow the user to view his or her history of completed quizzes and scores.</w:t>
+      </w:r>
+    </w:p>
+    <w:p>
+      <w:pPr>
+        <w:rPr>
+          <w:rFonts w:ascii="Times New Roman" w:hAnsi="Times New Roman" w:cs="Times New Roman"/>
+          <w:sz w:val="24"/>
+          <w:szCs w:val="24"/>
+        </w:rPr>
+      </w:pPr>
+      <w:r>
+        <w:rPr>
+          <w:rFonts w:ascii="Times New Roman" w:hAnsi="Times New Roman" w:cs="Times New Roman"/>
+          <w:b/>
+          <w:bCs/>
+          <w:sz w:val="24"/>
+          <w:szCs w:val="24"/>
+        </w:rPr>
+        <w:t>ID:</w:t>
+      </w:r>
+      <w:r>
+        <w:rPr>
+          <w:rFonts w:ascii="Times New Roman" w:hAnsi="Times New Roman" w:cs="Times New Roman"/>
+          <w:sz w:val="24"/>
+          <w:szCs w:val="24"/>
+        </w:rPr>
+        <w:t> FR-</w:t>
+      </w:r>
+      <w:r>
+        <w:rPr>
+          <w:rFonts w:ascii="Times New Roman" w:hAnsi="Times New Roman" w:cs="Times New Roman"/>
+          <w:sz w:val="24"/>
+          <w:szCs w:val="24"/>
+        </w:rPr>
+        <w:t>10</w:t>
+      </w:r>
+      <w:r>
+        <w:rPr>
+          <w:rFonts w:ascii="Times New Roman" w:hAnsi="Times New Roman" w:cs="Times New Roman"/>
+          <w:sz w:val="24"/>
+          <w:szCs w:val="24"/>
+        </w:rPr>
+        <w:t xml:space="preserve">  </w:t>
+      </w:r>
+      <w:r>
+        <w:rPr>
+          <w:rFonts w:ascii="Times New Roman" w:hAnsi="Times New Roman" w:cs="Times New Roman"/>
+          <w:sz w:val="24"/>
+          <w:szCs w:val="24"/>
+        </w:rPr>
+        <w:t xml:space="preserve"> </w:t>
+      </w:r>
+      <w:r>
+        <w:rPr>
+          <w:rFonts w:ascii="Times New Roman" w:hAnsi="Times New Roman" w:cs="Times New Roman"/>
+          <w:b/>
+          <w:bCs/>
+          <w:sz w:val="24"/>
+          <w:szCs w:val="24"/>
+        </w:rPr>
+        <w:t>Title:</w:t>
+      </w:r>
+      <w:r>
+        <w:rPr>
+          <w:rFonts w:ascii="Times New Roman" w:hAnsi="Times New Roman" w:cs="Times New Roman"/>
+          <w:sz w:val="24"/>
+          <w:szCs w:val="24"/>
+        </w:rPr>
+        <w:t> </w:t>
+      </w:r>
+      <w:r>
+        <w:rPr>
+          <w:rFonts w:ascii="Times New Roman" w:hAnsi="Times New Roman" w:cs="Times New Roman"/>
+          <w:sz w:val="24"/>
+          <w:szCs w:val="24"/>
+        </w:rPr>
+        <w:t>Quiz Management</w:t>
+      </w:r>
+      <w:r>
+        <w:rPr>
+          <w:rFonts w:ascii="Times New Roman" w:hAnsi="Times New Roman" w:cs="Times New Roman"/>
+          <w:sz w:val="24"/>
+          <w:szCs w:val="24"/>
+        </w:rPr>
+        <w:t xml:space="preserve">    </w:t>
+      </w:r>
+      <w:r>
+        <w:rPr>
+          <w:rFonts w:ascii="Times New Roman" w:hAnsi="Times New Roman" w:cs="Times New Roman"/>
+          <w:sz w:val="24"/>
+          <w:szCs w:val="24"/>
+        </w:rPr>
+        <w:t xml:space="preserve"> </w:t>
+      </w:r>
+      <w:r>
+        <w:rPr>
+          <w:rFonts w:ascii="Times New Roman" w:hAnsi="Times New Roman" w:cs="Times New Roman"/>
+          <w:b/>
+          <w:bCs/>
+          <w:sz w:val="24"/>
+          <w:szCs w:val="24"/>
+        </w:rPr>
+        <w:t>Description:</w:t>
+      </w:r>
+      <w:r>
+        <w:rPr>
+          <w:rFonts w:ascii="Times New Roman" w:hAnsi="Times New Roman" w:cs="Times New Roman"/>
+          <w:sz w:val="24"/>
+          <w:szCs w:val="24"/>
+        </w:rPr>
+        <w:t> </w:t>
+      </w:r>
+      <w:r>
+        <w:rPr>
+          <w:rFonts w:ascii="Times New Roman" w:hAnsi="Times New Roman" w:cs="Times New Roman"/>
+          <w:sz w:val="24"/>
+          <w:szCs w:val="24"/>
+        </w:rPr>
+        <w:t xml:space="preserve">The system should allow the </w:t>
+      </w:r>
+      <w:proofErr w:type="gramStart"/>
+      <w:r>
+        <w:rPr>
+          <w:rFonts w:ascii="Times New Roman" w:hAnsi="Times New Roman" w:cs="Times New Roman"/>
+          <w:sz w:val="24"/>
+          <w:szCs w:val="24"/>
+        </w:rPr>
+        <w:t>Instructor</w:t>
+      </w:r>
+      <w:proofErr w:type="gramEnd"/>
+      <w:r>
+        <w:rPr>
+          <w:rFonts w:ascii="Times New Roman" w:hAnsi="Times New Roman" w:cs="Times New Roman"/>
+          <w:sz w:val="24"/>
+          <w:szCs w:val="24"/>
+        </w:rPr>
+        <w:t xml:space="preserve"> to create, edit, and delete quizzes.</w:t>
+      </w:r>
+    </w:p>
+    <w:p>
+      <w:pPr>
+        <w:rPr>
+          <w:rFonts w:ascii="Times New Roman" w:hAnsi="Times New Roman" w:cs="Times New Roman"/>
+          <w:sz w:val="24"/>
+          <w:szCs w:val="24"/>
+        </w:rPr>
+      </w:pPr>
+      <w:r>
+        <w:rPr>
+          <w:rFonts w:ascii="Times New Roman" w:hAnsi="Times New Roman" w:cs="Times New Roman"/>
+          <w:b/>
+          <w:bCs/>
+          <w:sz w:val="24"/>
+          <w:szCs w:val="24"/>
+        </w:rPr>
+        <w:t>ID:</w:t>
+      </w:r>
+      <w:r>
+        <w:rPr>
+          <w:rFonts w:ascii="Times New Roman" w:hAnsi="Times New Roman" w:cs="Times New Roman"/>
+          <w:sz w:val="24"/>
+          <w:szCs w:val="24"/>
+        </w:rPr>
+        <w:t> FR-</w:t>
+      </w:r>
+      <w:r>
+        <w:rPr>
+          <w:rFonts w:ascii="Times New Roman" w:hAnsi="Times New Roman" w:cs="Times New Roman"/>
+          <w:sz w:val="24"/>
+          <w:szCs w:val="24"/>
+        </w:rPr>
+        <w:t>11</w:t>
+      </w:r>
+      <w:r>
+        <w:rPr>
+          <w:rFonts w:ascii="Times New Roman" w:hAnsi="Times New Roman" w:cs="Times New Roman"/>
+          <w:sz w:val="24"/>
+          <w:szCs w:val="24"/>
+        </w:rPr>
+        <w:t xml:space="preserve">   </w:t>
+      </w:r>
+      <w:r>
+        <w:rPr>
+          <w:rFonts w:ascii="Times New Roman" w:hAnsi="Times New Roman" w:cs="Times New Roman"/>
+          <w:b/>
+          <w:bCs/>
+          <w:sz w:val="24"/>
+          <w:szCs w:val="24"/>
+        </w:rPr>
+        <w:t>Title:</w:t>
+      </w:r>
+      <w:r>
+        <w:rPr>
+          <w:rFonts w:ascii="Times New Roman" w:hAnsi="Times New Roman" w:cs="Times New Roman"/>
+          <w:sz w:val="24"/>
+          <w:szCs w:val="24"/>
+        </w:rPr>
+        <w:t> </w:t>
+      </w:r>
+      <w:r>
+        <w:rPr>
+          <w:rFonts w:ascii="Times New Roman" w:hAnsi="Times New Roman" w:cs="Times New Roman"/>
+          <w:sz w:val="24"/>
+          <w:szCs w:val="24"/>
+        </w:rPr>
+        <w:t>Question Management</w:t>
+      </w:r>
+      <w:r>
+        <w:rPr>
+          <w:rFonts w:ascii="Times New Roman" w:hAnsi="Times New Roman" w:cs="Times New Roman"/>
+          <w:sz w:val="24"/>
+          <w:szCs w:val="24"/>
+        </w:rPr>
+        <w:t xml:space="preserve">   </w:t>
+      </w:r>
+      <w:r>
+        <w:rPr>
+          <w:rFonts w:ascii="Times New Roman" w:hAnsi="Times New Roman" w:cs="Times New Roman"/>
+          <w:b/>
+          <w:bCs/>
+          <w:sz w:val="24"/>
+          <w:szCs w:val="24"/>
+        </w:rPr>
+        <w:t>Description:</w:t>
+      </w:r>
+      <w:r>
+        <w:rPr>
+          <w:rFonts w:ascii="Times New Roman" w:hAnsi="Times New Roman" w:cs="Times New Roman"/>
+          <w:sz w:val="24"/>
+          <w:szCs w:val="24"/>
+        </w:rPr>
+        <w:t> </w:t>
+      </w:r>
+      <w:r>
+        <w:rPr>
+          <w:rFonts w:ascii="Times New Roman" w:hAnsi="Times New Roman" w:cs="Times New Roman"/>
+          <w:sz w:val="24"/>
+          <w:szCs w:val="24"/>
+        </w:rPr>
+        <w:t>The system must allow the instructor to add, edit, and remove questions from a quiz.</w:t>
+      </w:r>
+    </w:p>
+    <w:p>
+      <w:pPr>
+        <w:rPr>
+          <w:rFonts w:ascii="Times New Roman" w:hAnsi="Times New Roman" w:cs="Times New Roman"/>
+          <w:sz w:val="24"/>
+          <w:szCs w:val="24"/>
+        </w:rPr>
+      </w:pPr>
+      <w:r>
+        <w:rPr>
+          <w:rFonts w:ascii="Times New Roman" w:hAnsi="Times New Roman" w:cs="Times New Roman"/>
+          <w:b/>
+          <w:bCs/>
+          <w:sz w:val="24"/>
+          <w:szCs w:val="24"/>
+        </w:rPr>
+        <w:t>ID:</w:t>
+      </w:r>
+      <w:r>
+        <w:rPr>
+          <w:rFonts w:ascii="Times New Roman" w:hAnsi="Times New Roman" w:cs="Times New Roman"/>
+          <w:sz w:val="24"/>
+          <w:szCs w:val="24"/>
+        </w:rPr>
+        <w:t> FR-</w:t>
+      </w:r>
+      <w:r>
+        <w:rPr>
+          <w:rFonts w:ascii="Times New Roman" w:hAnsi="Times New Roman" w:cs="Times New Roman"/>
+          <w:sz w:val="24"/>
+          <w:szCs w:val="24"/>
+        </w:rPr>
+        <w:t>12</w:t>
+      </w:r>
+      <w:r>
+        <w:rPr>
+          <w:rFonts w:ascii="Times New Roman" w:hAnsi="Times New Roman" w:cs="Times New Roman"/>
+          <w:sz w:val="24"/>
+          <w:szCs w:val="24"/>
+        </w:rPr>
+        <w:t xml:space="preserve">   </w:t>
+      </w:r>
+      <w:r>
+        <w:rPr>
+          <w:rFonts w:ascii="Times New Roman" w:hAnsi="Times New Roman" w:cs="Times New Roman"/>
+          <w:b/>
+          <w:bCs/>
+          <w:sz w:val="24"/>
+          <w:szCs w:val="24"/>
+        </w:rPr>
+        <w:t>Title:</w:t>
+      </w:r>
+      <w:r>
+        <w:rPr>
+          <w:rFonts w:ascii="Times New Roman" w:hAnsi="Times New Roman" w:cs="Times New Roman"/>
+          <w:sz w:val="24"/>
+          <w:szCs w:val="24"/>
+        </w:rPr>
+        <w:t> </w:t>
+      </w:r>
+      <w:r>
+        <w:rPr>
+          <w:rFonts w:ascii="Times New Roman" w:hAnsi="Times New Roman" w:cs="Times New Roman"/>
+          <w:sz w:val="24"/>
+          <w:szCs w:val="24"/>
+        </w:rPr>
+        <w:t xml:space="preserve"> </w:t>
+      </w:r>
+      <w:r>
+        <w:rPr>
+          <w:rFonts w:ascii="Times New Roman" w:hAnsi="Times New Roman" w:cs="Times New Roman"/>
+          <w:sz w:val="24"/>
+          <w:szCs w:val="24"/>
+        </w:rPr>
+        <w:t>Question Type Support</w:t>
+      </w:r>
+      <w:r>
+        <w:rPr>
+          <w:rFonts w:ascii="Times New Roman" w:hAnsi="Times New Roman" w:cs="Times New Roman"/>
+          <w:sz w:val="24"/>
+          <w:szCs w:val="24"/>
+        </w:rPr>
+        <w:t xml:space="preserve">   </w:t>
+      </w:r>
+      <w:r>
+        <w:rPr>
+          <w:rFonts w:ascii="Times New Roman" w:hAnsi="Times New Roman" w:cs="Times New Roman"/>
+          <w:sz w:val="24"/>
+          <w:szCs w:val="24"/>
+        </w:rPr>
+        <w:t xml:space="preserve"> </w:t>
+      </w:r>
+      <w:r>
+        <w:rPr>
+          <w:rFonts w:ascii="Times New Roman" w:hAnsi="Times New Roman" w:cs="Times New Roman"/>
+          <w:b/>
+          <w:bCs/>
+          <w:sz w:val="24"/>
+          <w:szCs w:val="24"/>
+        </w:rPr>
+        <w:t>Description:</w:t>
+      </w:r>
+      <w:r>
+        <w:rPr>
+          <w:rFonts w:ascii="Times New Roman" w:hAnsi="Times New Roman" w:cs="Times New Roman"/>
+          <w:sz w:val="24"/>
+          <w:szCs w:val="24"/>
+        </w:rPr>
+        <w:t> </w:t>
+      </w:r>
+      <w:r>
+        <w:rPr>
+          <w:rFonts w:ascii="Times New Roman" w:hAnsi="Times New Roman" w:cs="Times New Roman"/>
+          <w:sz w:val="24"/>
+          <w:szCs w:val="24"/>
+        </w:rPr>
+        <w:t>The system must support the creation of different types of questions,</w:t>
+      </w:r>
+      <w:r>
+        <w:rPr>
+          <w:rFonts w:ascii="Times New Roman" w:hAnsi="Times New Roman" w:cs="Times New Roman"/>
+          <w:sz w:val="24"/>
+          <w:szCs w:val="24"/>
+        </w:rPr>
+        <w:t xml:space="preserve"> </w:t>
+      </w:r>
+      <w:r>
+        <w:rPr>
+          <w:rFonts w:ascii="Times New Roman" w:hAnsi="Times New Roman" w:cs="Times New Roman"/>
+          <w:sz w:val="24"/>
+          <w:szCs w:val="24"/>
+        </w:rPr>
+        <w:t xml:space="preserve">allowing the </w:t>
+      </w:r>
+      <w:proofErr w:type="gramStart"/>
+      <w:r>
+        <w:rPr>
+          <w:rFonts w:ascii="Times New Roman" w:hAnsi="Times New Roman" w:cs="Times New Roman"/>
+          <w:sz w:val="24"/>
+          <w:szCs w:val="24"/>
+        </w:rPr>
+        <w:t>Instructor</w:t>
+      </w:r>
+      <w:proofErr w:type="gramEnd"/>
+      <w:r>
+        <w:rPr>
+          <w:rFonts w:ascii="Times New Roman" w:hAnsi="Times New Roman" w:cs="Times New Roman"/>
+          <w:sz w:val="24"/>
+          <w:szCs w:val="24"/>
+        </w:rPr>
+        <w:t xml:space="preserve"> to select the desired format at the time of creation.</w:t>
+      </w:r>
+    </w:p>
+    <w:p>
+      <w:pPr>
+        <w:rPr>
+          <w:rFonts w:ascii="Times New Roman" w:hAnsi="Times New Roman" w:cs="Times New Roman"/>
+          <w:sz w:val="24"/>
+          <w:szCs w:val="24"/>
+        </w:rPr>
+      </w:pPr>
+      <w:r>
+        <w:rPr>
+          <w:rFonts w:ascii="Times New Roman" w:hAnsi="Times New Roman" w:cs="Times New Roman"/>
+          <w:b/>
+          <w:bCs/>
+          <w:sz w:val="24"/>
+          <w:szCs w:val="24"/>
+        </w:rPr>
+        <w:t>ID:</w:t>
+      </w:r>
+      <w:r>
+        <w:rPr>
+          <w:rFonts w:ascii="Times New Roman" w:hAnsi="Times New Roman" w:cs="Times New Roman"/>
+          <w:sz w:val="24"/>
+          <w:szCs w:val="24"/>
+        </w:rPr>
+        <w:t> FR-</w:t>
+      </w:r>
+      <w:r>
+        <w:rPr>
+          <w:rFonts w:ascii="Times New Roman" w:hAnsi="Times New Roman" w:cs="Times New Roman"/>
+          <w:sz w:val="24"/>
+          <w:szCs w:val="24"/>
+        </w:rPr>
+        <w:t>13</w:t>
+      </w:r>
+      <w:r>
+        <w:rPr>
+          <w:rFonts w:ascii="Times New Roman" w:hAnsi="Times New Roman" w:cs="Times New Roman"/>
+          <w:sz w:val="24"/>
+          <w:szCs w:val="24"/>
+        </w:rPr>
+        <w:t xml:space="preserve">   </w:t>
+      </w:r>
+      <w:r>
+        <w:rPr>
+          <w:rFonts w:ascii="Times New Roman" w:hAnsi="Times New Roman" w:cs="Times New Roman"/>
+          <w:b/>
+          <w:bCs/>
+          <w:sz w:val="24"/>
+          <w:szCs w:val="24"/>
+        </w:rPr>
+        <w:t>Title:</w:t>
+      </w:r>
+      <w:r>
+        <w:rPr>
+          <w:rFonts w:ascii="Times New Roman" w:hAnsi="Times New Roman" w:cs="Times New Roman"/>
+          <w:sz w:val="24"/>
+          <w:szCs w:val="24"/>
+        </w:rPr>
+        <w:t> </w:t>
+      </w:r>
+      <w:r>
+        <w:rPr>
+          <w:rFonts w:ascii="Times New Roman" w:hAnsi="Times New Roman" w:cs="Times New Roman"/>
+          <w:sz w:val="24"/>
+          <w:szCs w:val="24"/>
+        </w:rPr>
+        <w:t>Quiz Scheduling</w:t>
+      </w:r>
+      <w:r>
+        <w:rPr>
+          <w:rFonts w:ascii="Times New Roman" w:hAnsi="Times New Roman" w:cs="Times New Roman"/>
+          <w:sz w:val="24"/>
+          <w:szCs w:val="24"/>
+        </w:rPr>
+        <w:t xml:space="preserve">   </w:t>
+      </w:r>
+      <w:r>
+        <w:rPr>
+          <w:rFonts w:ascii="Times New Roman" w:hAnsi="Times New Roman" w:cs="Times New Roman"/>
+          <w:b/>
+          <w:bCs/>
+          <w:sz w:val="24"/>
+          <w:szCs w:val="24"/>
+        </w:rPr>
+        <w:t>Description:</w:t>
+      </w:r>
+      <w:r>
+        <w:t xml:space="preserve"> </w:t>
+      </w:r>
+      <w:r>
+        <w:rPr>
+          <w:rFonts w:ascii="Times New Roman" w:hAnsi="Times New Roman" w:cs="Times New Roman"/>
+          <w:sz w:val="24"/>
+          <w:szCs w:val="24"/>
+        </w:rPr>
+        <w:t xml:space="preserve">The system shall allow the </w:t>
+      </w:r>
+      <w:proofErr w:type="gramStart"/>
+      <w:r>
+        <w:rPr>
+          <w:rFonts w:ascii="Times New Roman" w:hAnsi="Times New Roman" w:cs="Times New Roman"/>
+          <w:sz w:val="24"/>
+          <w:szCs w:val="24"/>
+        </w:rPr>
+        <w:t>Instructor</w:t>
+      </w:r>
+      <w:proofErr w:type="gramEnd"/>
+      <w:r>
+        <w:rPr>
+          <w:rFonts w:ascii="Times New Roman" w:hAnsi="Times New Roman" w:cs="Times New Roman"/>
+          <w:sz w:val="24"/>
+          <w:szCs w:val="24"/>
+        </w:rPr>
+        <w:t xml:space="preserve"> to set a start date and an end date for each quiz.</w:t>
+      </w:r>
+      <w:r>
+        <w:rPr>
+          <w:rFonts w:ascii="Times New Roman" w:hAnsi="Times New Roman" w:cs="Times New Roman"/>
+          <w:sz w:val="24"/>
+          <w:szCs w:val="24"/>
+        </w:rPr>
+        <w:t> </w:t>
+      </w:r>
+    </w:p>
+    <w:p>
+      <w:pPr>
+        <w:rPr>
+          <w:rFonts w:ascii="Times New Roman" w:hAnsi="Times New Roman" w:cs="Times New Roman"/>
+          <w:sz w:val="24"/>
+          <w:szCs w:val="24"/>
+        </w:rPr>
+      </w:pPr>
+      <w:r>
+        <w:rPr>
+          <w:rFonts w:ascii="Times New Roman" w:hAnsi="Times New Roman" w:cs="Times New Roman"/>
+          <w:b/>
+          <w:bCs/>
+          <w:sz w:val="24"/>
+          <w:szCs w:val="24"/>
+        </w:rPr>
+        <w:t>ID:</w:t>
+      </w:r>
+      <w:r>
+        <w:rPr>
+          <w:rFonts w:ascii="Times New Roman" w:hAnsi="Times New Roman" w:cs="Times New Roman"/>
+          <w:sz w:val="24"/>
+          <w:szCs w:val="24"/>
+        </w:rPr>
+        <w:t> FR-</w:t>
+      </w:r>
+      <w:r>
+        <w:rPr>
+          <w:rFonts w:ascii="Times New Roman" w:hAnsi="Times New Roman" w:cs="Times New Roman"/>
+          <w:sz w:val="24"/>
+          <w:szCs w:val="24"/>
+        </w:rPr>
+        <w:t>14</w:t>
+      </w:r>
+      <w:r>
+        <w:rPr>
+          <w:rFonts w:ascii="Times New Roman" w:hAnsi="Times New Roman" w:cs="Times New Roman"/>
+          <w:sz w:val="24"/>
+          <w:szCs w:val="24"/>
+        </w:rPr>
+        <w:t xml:space="preserve">   </w:t>
+      </w:r>
+      <w:r>
+        <w:rPr>
+          <w:rFonts w:ascii="Times New Roman" w:hAnsi="Times New Roman" w:cs="Times New Roman"/>
+          <w:b/>
+          <w:bCs/>
+          <w:sz w:val="24"/>
+          <w:szCs w:val="24"/>
+        </w:rPr>
+        <w:t>Title:</w:t>
+      </w:r>
+      <w:r>
+        <w:rPr>
+          <w:rFonts w:ascii="Times New Roman" w:hAnsi="Times New Roman" w:cs="Times New Roman"/>
+          <w:sz w:val="24"/>
+          <w:szCs w:val="24"/>
+        </w:rPr>
+        <w:t> </w:t>
+      </w:r>
+      <w:r>
+        <w:rPr>
+          <w:rFonts w:ascii="Times New Roman" w:hAnsi="Times New Roman" w:cs="Times New Roman"/>
+          <w:sz w:val="24"/>
+          <w:szCs w:val="24"/>
+        </w:rPr>
+        <w:t>View Student Results</w:t>
+      </w:r>
+      <w:r>
+        <w:rPr>
+          <w:rFonts w:ascii="Times New Roman" w:hAnsi="Times New Roman" w:cs="Times New Roman"/>
+          <w:sz w:val="24"/>
+          <w:szCs w:val="24"/>
+        </w:rPr>
+        <w:t xml:space="preserve">   </w:t>
+      </w:r>
+      <w:r>
+        <w:rPr>
+          <w:rFonts w:ascii="Times New Roman" w:hAnsi="Times New Roman" w:cs="Times New Roman"/>
+          <w:b/>
+          <w:bCs/>
+          <w:sz w:val="24"/>
+          <w:szCs w:val="24"/>
+        </w:rPr>
+        <w:t>Description:</w:t>
+      </w:r>
+      <w:r>
+        <w:rPr>
+          <w:rFonts w:ascii="Times New Roman" w:hAnsi="Times New Roman" w:cs="Times New Roman"/>
+          <w:sz w:val="24"/>
+          <w:szCs w:val="24"/>
+        </w:rPr>
+        <w:t> </w:t>
+      </w:r>
+      <w:r>
+        <w:rPr>
+          <w:rFonts w:ascii="Times New Roman" w:hAnsi="Times New Roman" w:cs="Times New Roman"/>
+          <w:sz w:val="24"/>
+          <w:szCs w:val="24"/>
+        </w:rPr>
+        <w:t xml:space="preserve">The system shall allow the </w:t>
+      </w:r>
+      <w:proofErr w:type="gramStart"/>
+      <w:r>
+        <w:rPr>
+          <w:rFonts w:ascii="Times New Roman" w:hAnsi="Times New Roman" w:cs="Times New Roman"/>
+          <w:sz w:val="24"/>
+          <w:szCs w:val="24"/>
+        </w:rPr>
+        <w:t>Instructor</w:t>
+      </w:r>
+      <w:proofErr w:type="gramEnd"/>
+      <w:r>
+        <w:rPr>
+          <w:rFonts w:ascii="Times New Roman" w:hAnsi="Times New Roman" w:cs="Times New Roman"/>
+          <w:sz w:val="24"/>
+          <w:szCs w:val="24"/>
+        </w:rPr>
+        <w:t xml:space="preserve"> to consult users' results</w:t>
+      </w:r>
+    </w:p>
+    <w:p>
+      <w:pPr>
+        <w:rPr>
+          <w:rFonts w:ascii="Times New Roman" w:hAnsi="Times New Roman" w:cs="Times New Roman"/>
+          <w:sz w:val="24"/>
+          <w:szCs w:val="24"/>
+        </w:rPr>
+      </w:pPr>
+      <w:r>
+        <w:rPr>
+          <w:rFonts w:ascii="Times New Roman" w:hAnsi="Times New Roman" w:cs="Times New Roman"/>
+          <w:b/>
+          <w:bCs/>
+          <w:sz w:val="24"/>
+          <w:szCs w:val="24"/>
+        </w:rPr>
+        <w:t>ID:</w:t>
+      </w:r>
+      <w:r>
+        <w:rPr>
+          <w:rFonts w:ascii="Times New Roman" w:hAnsi="Times New Roman" w:cs="Times New Roman"/>
+          <w:sz w:val="24"/>
+          <w:szCs w:val="24"/>
+        </w:rPr>
+        <w:t> FR-</w:t>
+      </w:r>
+      <w:r>
+        <w:rPr>
+          <w:rFonts w:ascii="Times New Roman" w:hAnsi="Times New Roman" w:cs="Times New Roman"/>
+          <w:sz w:val="24"/>
+          <w:szCs w:val="24"/>
+        </w:rPr>
+        <w:t>15</w:t>
+      </w:r>
+      <w:r>
+        <w:rPr>
+          <w:rFonts w:ascii="Times New Roman" w:hAnsi="Times New Roman" w:cs="Times New Roman"/>
+          <w:sz w:val="24"/>
+          <w:szCs w:val="24"/>
+        </w:rPr>
+        <w:t xml:space="preserve">   </w:t>
+      </w:r>
+      <w:r>
+        <w:rPr>
+          <w:rFonts w:ascii="Times New Roman" w:hAnsi="Times New Roman" w:cs="Times New Roman"/>
+          <w:b/>
+          <w:bCs/>
+          <w:sz w:val="24"/>
+          <w:szCs w:val="24"/>
+        </w:rPr>
+        <w:t>Title:</w:t>
+      </w:r>
+      <w:r>
+        <w:rPr>
+          <w:rFonts w:ascii="Times New Roman" w:hAnsi="Times New Roman" w:cs="Times New Roman"/>
+          <w:sz w:val="24"/>
+          <w:szCs w:val="24"/>
+        </w:rPr>
+        <w:t> </w:t>
+      </w:r>
+      <w:r>
+        <w:rPr>
+          <w:rFonts w:ascii="Times New Roman" w:hAnsi="Times New Roman" w:cs="Times New Roman"/>
+          <w:sz w:val="24"/>
+          <w:szCs w:val="24"/>
+        </w:rPr>
+        <w:t>Quiz Timer</w:t>
+      </w:r>
+      <w:r>
+        <w:rPr>
+          <w:rFonts w:ascii="Times New Roman" w:hAnsi="Times New Roman" w:cs="Times New Roman"/>
+          <w:sz w:val="24"/>
+          <w:szCs w:val="24"/>
+        </w:rPr>
+        <w:t xml:space="preserve">    </w:t>
+      </w:r>
+      <w:r>
+        <w:rPr>
+          <w:rFonts w:ascii="Times New Roman" w:hAnsi="Times New Roman" w:cs="Times New Roman"/>
+          <w:b/>
+          <w:bCs/>
+          <w:sz w:val="24"/>
+          <w:szCs w:val="24"/>
+        </w:rPr>
+        <w:t>Description:</w:t>
+      </w:r>
+      <w:r>
+        <w:rPr>
+          <w:rFonts w:ascii="Times New Roman" w:hAnsi="Times New Roman" w:cs="Times New Roman"/>
+          <w:sz w:val="24"/>
+          <w:szCs w:val="24"/>
+        </w:rPr>
+        <w:t> </w:t>
+      </w:r>
+      <w:r>
+        <w:rPr>
+          <w:rFonts w:ascii="Times New Roman" w:hAnsi="Times New Roman" w:cs="Times New Roman"/>
+          <w:sz w:val="24"/>
+          <w:szCs w:val="24"/>
+        </w:rPr>
+        <w:t xml:space="preserve">The system shall allow the </w:t>
+      </w:r>
+      <w:proofErr w:type="gramStart"/>
+      <w:r>
+        <w:rPr>
+          <w:rFonts w:ascii="Times New Roman" w:hAnsi="Times New Roman" w:cs="Times New Roman"/>
+          <w:sz w:val="24"/>
+          <w:szCs w:val="24"/>
+        </w:rPr>
+        <w:t>Instructor</w:t>
+      </w:r>
+      <w:proofErr w:type="gramEnd"/>
+      <w:r>
+        <w:rPr>
+          <w:rFonts w:ascii="Times New Roman" w:hAnsi="Times New Roman" w:cs="Times New Roman"/>
+          <w:sz w:val="24"/>
+          <w:szCs w:val="24"/>
+        </w:rPr>
+        <w:t xml:space="preserve"> to set a time for the completion of the quiz.</w:t>
+      </w:r>
     </w:p>
     <w:p>
       <w:pPr>
@@ -6056,152 +7829,222 @@
           <w:numId w:val="0"/>
         </w:numPr>
         <w:ind w:left="360" w:hanging="360"/>
-      </w:pPr>
-      <w:bookmarkStart w:id="16" w:name="_Toc223948347"/>
-      <w:r>
-        <w:t>4.2 Non</w:t>
-      </w:r>
-      <w:r>
-        <w:t>-Functional Requirements (NFRs)</w:t>
-      </w:r>
-      <w:bookmarkEnd w:id="16"/>
-    </w:p>
-    <w:p>
-      <w:pPr>
-        <w:rPr>
-          <w:rFonts w:ascii="Times New Roman" w:hAnsi="Times New Roman" w:cs="Times New Roman"/>
-          <w:sz w:val="24"/>
-          <w:szCs w:val="24"/>
-        </w:rPr>
-      </w:pPr>
-      <w:r>
-        <w:rPr>
-          <w:rFonts w:ascii="Times New Roman" w:hAnsi="Times New Roman" w:cs="Times New Roman"/>
-          <w:sz w:val="24"/>
-          <w:szCs w:val="24"/>
-        </w:rPr>
-        <w:t>Specify the quality attributes. Categorize them.</w:t>
-      </w:r>
-    </w:p>
-    <w:p>
-      <w:pPr>
-        <w:numPr>
-          <w:ilvl w:val="1"/>
-          <w:numId w:val="9"/>
-        </w:numPr>
-        <w:rPr>
-          <w:rFonts w:ascii="Times New Roman" w:hAnsi="Times New Roman" w:cs="Times New Roman"/>
-          <w:sz w:val="24"/>
-          <w:szCs w:val="24"/>
-        </w:rPr>
-      </w:pPr>
-      <w:r>
-        <w:rPr>
-          <w:rFonts w:ascii="Times New Roman" w:hAnsi="Times New Roman" w:cs="Times New Roman"/>
+        <w:rPr>
+          <w:b w:val="0"/>
+          <w:bCs w:val="0"/>
           <w:i/>
           <w:iCs/>
-          <w:sz w:val="24"/>
-          <w:szCs w:val="24"/>
-        </w:rPr>
-        <w:t>Performance:</w:t>
-      </w:r>
-      <w:r>
-        <w:rPr>
-          <w:rFonts w:ascii="Times New Roman" w:hAnsi="Times New Roman" w:cs="Times New Roman"/>
-          <w:sz w:val="24"/>
-          <w:szCs w:val="24"/>
-        </w:rPr>
-        <w:t> "The system shall load the dashboard in under 2 seconds."</w:t>
-      </w:r>
-    </w:p>
-    <w:p>
-      <w:pPr>
-        <w:numPr>
-          <w:ilvl w:val="1"/>
-          <w:numId w:val="9"/>
-        </w:numPr>
-        <w:rPr>
-          <w:rFonts w:ascii="Times New Roman" w:hAnsi="Times New Roman" w:cs="Times New Roman"/>
-          <w:sz w:val="24"/>
-          <w:szCs w:val="24"/>
-        </w:rPr>
-      </w:pPr>
-      <w:r>
-        <w:rPr>
-          <w:rFonts w:ascii="Times New Roman" w:hAnsi="Times New Roman" w:cs="Times New Roman"/>
-          <w:i/>
-          <w:iCs/>
-          <w:sz w:val="24"/>
-          <w:szCs w:val="24"/>
-        </w:rPr>
-        <w:t>Security:</w:t>
-      </w:r>
-      <w:r>
-        <w:rPr>
-          <w:rFonts w:ascii="Times New Roman" w:hAnsi="Times New Roman" w:cs="Times New Roman"/>
-          <w:sz w:val="24"/>
-          <w:szCs w:val="24"/>
-        </w:rPr>
-        <w:t> "All user passwords shall be stored in an encrypted format."</w:t>
-      </w:r>
-    </w:p>
-    <w:p>
-      <w:pPr>
-        <w:numPr>
-          <w:ilvl w:val="1"/>
-          <w:numId w:val="9"/>
-        </w:numPr>
-        <w:rPr>
-          <w:rFonts w:ascii="Times New Roman" w:hAnsi="Times New Roman" w:cs="Times New Roman"/>
-          <w:sz w:val="24"/>
-          <w:szCs w:val="24"/>
-        </w:rPr>
-      </w:pPr>
-      <w:r>
-        <w:rPr>
-          <w:rFonts w:ascii="Times New Roman" w:hAnsi="Times New Roman" w:cs="Times New Roman"/>
-          <w:i/>
-          <w:iCs/>
-          <w:sz w:val="24"/>
-          <w:szCs w:val="24"/>
-        </w:rPr>
-        <w:t>Usability:</w:t>
-      </w:r>
-      <w:r>
-        <w:rPr>
-          <w:rFonts w:ascii="Times New Roman" w:hAnsi="Times New Roman" w:cs="Times New Roman"/>
-          <w:sz w:val="24"/>
-          <w:szCs w:val="24"/>
-        </w:rPr>
-        <w:t> "The interface shall be intuitive enough for a non-technical user to learn basic functions within 10 minutes."</w:t>
-      </w:r>
-    </w:p>
-    <w:p>
-      <w:pPr>
-        <w:rPr>
-          <w:rFonts w:ascii="Times New Roman" w:hAnsi="Times New Roman" w:cs="Times New Roman"/>
-          <w:sz w:val="24"/>
-          <w:szCs w:val="24"/>
-        </w:rPr>
-      </w:pPr>
-    </w:p>
-    <w:p>
-      <w:pPr>
-        <w:rPr>
-          <w:rFonts w:ascii="Times New Roman" w:hAnsi="Times New Roman" w:cs="Times New Roman"/>
-          <w:sz w:val="24"/>
-          <w:szCs w:val="24"/>
-        </w:rPr>
-      </w:pPr>
-    </w:p>
-    <w:p>
-      <w:pPr>
-        <w:rPr>
-          <w:rFonts w:ascii="Times New Roman" w:hAnsi="Times New Roman" w:cs="Times New Roman"/>
-          <w:sz w:val="24"/>
-          <w:szCs w:val="24"/>
-        </w:rPr>
-      </w:pPr>
+        </w:rPr>
+      </w:pPr>
+      <w:bookmarkStart w:id="16" w:name="_Toc223948347"/>
+      <w:r>
+        <w:t>4.2 Non</w:t>
+      </w:r>
+      <w:r>
+        <w:t>-Functional Requirements (NFRs)</w:t>
+      </w:r>
+      <w:bookmarkEnd w:id="16"/>
+    </w:p>
+    <w:p>
+      <w:r>
+        <w:t xml:space="preserve">NFR-01: Password </w:t>
+      </w:r>
+      <w:proofErr w:type="gramStart"/>
+      <w:r>
+        <w:t>Security</w:t>
+      </w:r>
+      <w:r>
+        <w:t xml:space="preserve"> :</w:t>
+      </w:r>
+      <w:proofErr w:type="gramEnd"/>
+      <w:r>
+        <w:t xml:space="preserve"> </w:t>
+      </w:r>
+      <w:r>
+        <w:t>The system shall store users' passwords securely using appropriate hash functions.</w:t>
+      </w:r>
+    </w:p>
+    <w:p>
+      <w:r>
+        <w:t xml:space="preserve">NFR-02: Access </w:t>
+      </w:r>
+      <w:proofErr w:type="gramStart"/>
+      <w:r>
+        <w:t>Control</w:t>
+      </w:r>
+      <w:r>
+        <w:t xml:space="preserve"> :</w:t>
+      </w:r>
+      <w:proofErr w:type="gramEnd"/>
+      <w:r>
+        <w:t xml:space="preserve"> </w:t>
+      </w:r>
+      <w:r>
+        <w:t>Only the Authenticated Instructor can access the admin panel, with no access for regular users.</w:t>
+      </w:r>
+    </w:p>
+    <w:p>
+      <w:r>
+        <w:t xml:space="preserve">NFR-03: Browser </w:t>
+      </w:r>
+      <w:proofErr w:type="gramStart"/>
+      <w:r>
+        <w:t>Compatibility</w:t>
+      </w:r>
+      <w:r>
+        <w:t xml:space="preserve"> :</w:t>
+      </w:r>
+      <w:proofErr w:type="gramEnd"/>
+      <w:r>
+        <w:t xml:space="preserve"> </w:t>
+      </w:r>
+      <w:r>
+        <w:t>The application must be compatible with the latest browsers: Google Chrome, Mozilla Firefox, Safari, and Microsoft Edge.</w:t>
+      </w:r>
+    </w:p>
+    <w:p>
+      <w:r>
+        <w:t>NFR-04: Data Recovery (Reliability</w:t>
+      </w:r>
+      <w:proofErr w:type="gramStart"/>
+      <w:r>
+        <w:t>)</w:t>
+      </w:r>
+      <w:r>
+        <w:t xml:space="preserve"> :</w:t>
+      </w:r>
+      <w:proofErr w:type="gramEnd"/>
+      <w:r>
+        <w:t xml:space="preserve"> </w:t>
+      </w:r>
+      <w:r>
+        <w:t>The system shall ensure that user data and quizzes are not lost in the event of a network failure during a quiz run, returning to their previous state after</w:t>
+      </w:r>
+    </w:p>
+    <w:p>
+      <w:r>
+        <w:t>reconnection.</w:t>
+      </w:r>
+    </w:p>
+    <w:p>
+      <w:r>
+        <w:t xml:space="preserve">NFR-05: System </w:t>
+      </w:r>
+      <w:proofErr w:type="gramStart"/>
+      <w:r>
+        <w:t>Availability</w:t>
+      </w:r>
+      <w:r>
+        <w:t xml:space="preserve"> :</w:t>
+      </w:r>
+      <w:proofErr w:type="gramEnd"/>
+      <w:r>
+        <w:t xml:space="preserve"> </w:t>
+      </w:r>
+      <w:r>
+        <w:t>The system shall be available at all times, except during scheduled maintenance periods</w:t>
+      </w:r>
+    </w:p>
+    <w:p>
+      <w:r>
+        <w:t xml:space="preserve">NFR-06: Database Design </w:t>
+      </w:r>
+      <w:proofErr w:type="gramStart"/>
+      <w:r>
+        <w:t>Documentation</w:t>
+      </w:r>
+      <w:r>
+        <w:t xml:space="preserve"> :</w:t>
+      </w:r>
+      <w:proofErr w:type="gramEnd"/>
+      <w:r>
+        <w:t xml:space="preserve"> </w:t>
+      </w:r>
+      <w:r>
+        <w:t>The database must be accompanied by an entity-relationship diagram</w:t>
+      </w:r>
+    </w:p>
+    <w:p>
+      <w:r>
+        <w:t>NFR-07: Usability &amp; UI Consistency</w:t>
+      </w:r>
+      <w:r>
+        <w:t xml:space="preserve">: </w:t>
+      </w:r>
+      <w:r>
+        <w:t>Navigation elements must be consistent across all pages and the system should provide immediate visual feedback for actions such as selecting a response or submitting a form.</w:t>
+      </w:r>
+    </w:p>
+    <w:p>
+      <w:r>
+        <w:t>NFR-08: Performance (Loading Time)</w:t>
+      </w:r>
+      <w:r>
+        <w:t xml:space="preserve">: </w:t>
+      </w:r>
+      <w:r>
+        <w:t>The loading time of each page should not exceed 3 seconds on standard broadband connections.</w:t>
+      </w:r>
+    </w:p>
+    <w:p>
+      <w:r>
+        <w:t>NFR-09: Data Integrity</w:t>
+      </w:r>
+      <w:r>
+        <w:t xml:space="preserve">: </w:t>
+      </w:r>
+      <w:r>
+        <w:t>The system shall ensure data integrity by ensuring that the score given to each quiz matches exactly the number of correct answers, without calculation failures or duplicate records of answers.</w:t>
+      </w:r>
+    </w:p>
+    <w:p>
+      <w:r>
+        <w:t>NFR-10: Privacy &amp; Consent</w:t>
+      </w:r>
+      <w:r>
+        <w:t xml:space="preserve">: </w:t>
+      </w:r>
+      <w:r>
+        <w:t>The system shall not collect sensitive data from users without informed consent.</w:t>
+      </w:r>
+    </w:p>
+    <w:p>
+      <w:r>
+        <w:t xml:space="preserve">NFR-11: Legal </w:t>
+      </w:r>
+      <w:proofErr w:type="gramStart"/>
+      <w:r>
+        <w:t>Compliance</w:t>
+      </w:r>
+      <w:r>
+        <w:t xml:space="preserve"> :</w:t>
+      </w:r>
+      <w:proofErr w:type="gramEnd"/>
+      <w:r>
+        <w:t xml:space="preserve"> </w:t>
+      </w:r>
+      <w:r>
+        <w:t>The development and operation of the system must comply with current copyright and intellectual property laws.</w:t>
+      </w:r>
+    </w:p>
+    <w:p>
+      <w:r>
+        <w:t>NFR-12: Audit Logging</w:t>
+      </w:r>
+      <w:r>
+        <w:t xml:space="preserve">: </w:t>
+      </w:r>
+      <w:r>
+        <w:t xml:space="preserve">The system must maintain an audit trail for all actions performed by the </w:t>
+      </w:r>
+      <w:proofErr w:type="gramStart"/>
+      <w:r>
+        <w:t>Instructor</w:t>
+      </w:r>
+      <w:proofErr w:type="gramEnd"/>
+      <w:r>
+        <w:t>, including creating, editing, and deleting quizzes and questions.</w:t>
+      </w:r>
     </w:p>
     <w:p>
       <w:pPr>
@@ -6263,47 +8106,10 @@
       </w:pPr>
       <w:bookmarkStart w:id="17" w:name="_Toc223948348"/>
       <w:r>
+        <w:lastRenderedPageBreak/>
         <w:t>Chapter 5: System Modelling</w:t>
       </w:r>
       <w:bookmarkEnd w:id="17"/>
-    </w:p>
-    <w:p>
-      <w:pPr>
-        <w:rPr>
-          <w:rFonts w:ascii="Times New Roman" w:hAnsi="Times New Roman" w:cs="Times New Roman"/>
-          <w:sz w:val="24"/>
-          <w:szCs w:val="24"/>
-        </w:rPr>
-      </w:pPr>
-      <w:r>
-        <w:rPr>
-          <w:rFonts w:ascii="Times New Roman" w:hAnsi="Times New Roman" w:cs="Times New Roman"/>
-          <w:sz w:val="24"/>
-          <w:szCs w:val="24"/>
-        </w:rPr>
-        <w:br/>
-      </w:r>
-      <w:r>
-        <w:rPr>
-          <w:rFonts w:ascii="Times New Roman" w:hAnsi="Times New Roman" w:cs="Times New Roman"/>
-          <w:i/>
-          <w:iCs/>
-          <w:sz w:val="24"/>
-          <w:szCs w:val="24"/>
-        </w:rPr>
-        <w:t>This is the core technical chapter. All diagrams must be professionally drawn, clear, and include a brief explanatory text.</w:t>
-      </w:r>
-    </w:p>
-    <w:p>
-      <w:pPr>
-        <w:rPr>
-          <w:rFonts w:ascii="Times New Roman" w:hAnsi="Times New Roman" w:cs="Times New Roman"/>
-          <w:b/>
-          <w:bCs/>
-          <w:sz w:val="24"/>
-          <w:szCs w:val="24"/>
-        </w:rPr>
-      </w:pPr>
     </w:p>
     <w:p>
       <w:pPr>
@@ -6315,54 +8121,87 @@
       </w:pPr>
       <w:bookmarkStart w:id="18" w:name="_Toc223948349"/>
       <w:r>
+        <w:t>Use Case Model</w:t>
+      </w:r>
+      <w:bookmarkEnd w:id="18"/>
+    </w:p>
+    <w:p>
+      <w:pPr>
+        <w:pStyle w:val="Heading3"/>
+      </w:pPr>
+      <w:bookmarkStart w:id="19" w:name="_Toc223948350"/>
+      <w:r>
+        <w:t>Use Case Diagram</w:t>
+      </w:r>
+      <w:bookmarkEnd w:id="19"/>
+    </w:p>
+    <w:p>
+      <w:pPr>
+        <w:rPr>
+          <w:rFonts w:ascii="Times New Roman" w:hAnsi="Times New Roman" w:cs="Times New Roman"/>
+          <w:sz w:val="24"/>
+          <w:szCs w:val="24"/>
+        </w:rPr>
+      </w:pPr>
+      <w:r>
+        <w:rPr>
+          <w:noProof/>
+        </w:rPr>
+        <w:drawing>
+          <wp:inline distT="0" distB="0" distL="0" distR="0" wp14:anchorId="1C1FA840" wp14:editId="66E35F6E">
+            <wp:extent cx="4335625" cy="7103129"/>
+            <wp:effectExtent l="0" t="0" r="8255" b="2540"/>
+            <wp:docPr id="3" name="Image 1"/>
+            <wp:cNvGraphicFramePr>
+              <a:graphicFrameLocks xmlns:a="http://schemas.openxmlformats.org/drawingml/2006/main"/>
+            </wp:cNvGraphicFramePr>
+            <a:graphic xmlns:a="http://schemas.openxmlformats.org/drawingml/2006/main">
+              <a:graphicData uri="http://schemas.openxmlformats.org/drawingml/2006/picture">
+                <pic:pic xmlns:pic="http://schemas.openxmlformats.org/drawingml/2006/picture">
+                  <pic:nvPicPr>
+                    <pic:cNvPr id="1" name="Image 1"/>
+                    <pic:cNvPicPr>
+                      <a:picLocks/>
+                    </pic:cNvPicPr>
+                  </pic:nvPicPr>
+                  <pic:blipFill>
+                    <a:blip r:embed="rId8" cstate="print"/>
+                    <a:stretch>
+                      <a:fillRect/>
+                    </a:stretch>
+                  </pic:blipFill>
+                  <pic:spPr>
+                    <a:xfrm>
+                      <a:off x="0" y="0"/>
+                      <a:ext cx="4353108" cy="7131772"/>
+                    </a:xfrm>
+                    <a:prstGeom prst="rect">
+                      <a:avLst/>
+                    </a:prstGeom>
+                  </pic:spPr>
+                </pic:pic>
+              </a:graphicData>
+            </a:graphic>
+          </wp:inline>
+        </w:drawing>
+      </w:r>
+    </w:p>
+    <w:p>
+      <w:pPr>
+        <w:rPr>
+          <w:rFonts w:ascii="Times New Roman" w:hAnsi="Times New Roman" w:cs="Times New Roman"/>
+          <w:sz w:val="24"/>
+          <w:szCs w:val="24"/>
+        </w:rPr>
+      </w:pPr>
+    </w:p>
+    <w:p>
+      <w:pPr>
+        <w:pStyle w:val="Heading3"/>
+      </w:pPr>
+      <w:bookmarkStart w:id="20" w:name="_Toc223948351"/>
+      <w:r>
         <w:lastRenderedPageBreak/>
-        <w:t>Use Case Model</w:t>
-      </w:r>
-      <w:bookmarkEnd w:id="18"/>
-    </w:p>
-    <w:p>
-      <w:pPr>
-        <w:rPr>
-          <w:rFonts w:ascii="Times New Roman" w:hAnsi="Times New Roman" w:cs="Times New Roman"/>
-          <w:sz w:val="24"/>
-          <w:szCs w:val="24"/>
-        </w:rPr>
-      </w:pPr>
-    </w:p>
-    <w:p>
-      <w:pPr>
-        <w:pStyle w:val="Heading3"/>
-      </w:pPr>
-      <w:bookmarkStart w:id="19" w:name="_Toc223948350"/>
-      <w:r>
-        <w:t>Use Case Diagram</w:t>
-      </w:r>
-      <w:bookmarkEnd w:id="19"/>
-    </w:p>
-    <w:p>
-      <w:pPr>
-        <w:rPr>
-          <w:rFonts w:ascii="Times New Roman" w:hAnsi="Times New Roman" w:cs="Times New Roman"/>
-          <w:sz w:val="24"/>
-          <w:szCs w:val="24"/>
-        </w:rPr>
-      </w:pPr>
-    </w:p>
-    <w:p>
-      <w:pPr>
-        <w:rPr>
-          <w:rFonts w:ascii="Times New Roman" w:hAnsi="Times New Roman" w:cs="Times New Roman"/>
-          <w:sz w:val="24"/>
-          <w:szCs w:val="24"/>
-        </w:rPr>
-      </w:pPr>
-    </w:p>
-    <w:p>
-      <w:pPr>
-        <w:pStyle w:val="Heading3"/>
-      </w:pPr>
-      <w:bookmarkStart w:id="20" w:name="_Toc223948351"/>
-      <w:r>
         <w:t>Detailed Use Case Descriptions:</w:t>
       </w:r>
       <w:bookmarkEnd w:id="20"/>
@@ -6771,7 +8610,6 @@
       </w:pPr>
       <w:bookmarkStart w:id="26" w:name="_Toc223948357"/>
       <w:r>
-        <w:lastRenderedPageBreak/>
         <w:t>5.4 Data Flow Model</w:t>
       </w:r>
       <w:bookmarkEnd w:id="26"/>
@@ -7500,6 +9338,7 @@
           <w:sz w:val="24"/>
           <w:szCs w:val="24"/>
         </w:rPr>
+        <w:lastRenderedPageBreak/>
         <w:t>Test cases for key functionalities (table format)</w:t>
       </w:r>
       <w:r>
@@ -7783,7 +9622,6 @@
           <w:sz w:val="24"/>
           <w:szCs w:val="24"/>
         </w:rPr>
-        <w:lastRenderedPageBreak/>
         <w:t>Briefly recap the project, the problem solved, and the key models produced.</w:t>
       </w:r>
     </w:p>
@@ -7854,6 +9692,7 @@
           <w:sz w:val="24"/>
           <w:szCs w:val="24"/>
         </w:rPr>
+        <w:lastRenderedPageBreak/>
         <w:t>Discuss technical, collaborative, or planning challenges and what you learned from them.</w:t>
       </w:r>
     </w:p>
@@ -8986,7 +10825,7 @@
         <w:sz w:val="20"/>
       </w:rPr>
     </w:lvl>
-    <w:lvl w:ilvl="3" w:tentative="1">
+    <w:lvl w:ilvl="3">
       <w:start w:val="1"/>
       <w:numFmt w:val="bullet"/>
       <w:lvlText w:val=""/>

</xml_diff>